<commit_message>
menambahkan implementasi dengan state-based construction
</commit_message>
<xml_diff>
--- a/Laporan TP Modul 4.docx
+++ b/Laporan TP Modul 4.docx
@@ -2,7 +2,3517 @@
 <file path=word/document.xml><?xml version="1.0" encoding="utf-8"?>
 <w:document xmlns:wpc="http://schemas.microsoft.com/office/word/2010/wordprocessingCanvas" xmlns:cx="http://schemas.microsoft.com/office/drawing/2014/chartex" xmlns:cx1="http://schemas.microsoft.com/office/drawing/2015/9/8/chartex" xmlns:cx2="http://schemas.microsoft.com/office/drawing/2015/10/21/chartex" xmlns:cx3="http://schemas.microsoft.com/office/drawing/2016/5/9/chartex" xmlns:cx4="http://schemas.microsoft.com/office/drawing/2016/5/10/chartex" xmlns:cx5="http://schemas.microsoft.com/office/drawing/2016/5/11/chartex" xmlns:cx6="http://schemas.microsoft.com/office/drawing/2016/5/12/chartex" xmlns:cx7="http://schemas.microsoft.com/office/drawing/2016/5/13/chartex" xmlns:cx8="http://schemas.microsoft.com/office/drawing/2016/5/14/chartex" xmlns:mc="http://schemas.openxmlformats.org/markup-compatibility/2006" xmlns:aink="http://schemas.microsoft.com/office/drawing/2016/ink" xmlns:am3d="http://schemas.microsoft.com/office/drawing/2017/model3d" xmlns:o="urn:schemas-microsoft-com:office:office" xmlns:oel="http://schemas.microsoft.com/office/2019/extlst" xmlns:r="http://schemas.openxmlformats.org/officeDocument/2006/relationships" xmlns:m="http://schemas.openxmlformats.org/officeDocument/2006/math" xmlns:v="urn:schemas-microsoft-com:vml" xmlns:wp14="http://schemas.microsoft.com/office/word/2010/wordprocessingDrawing" xmlns:wp="http://schemas.openxmlformats.org/drawingml/2006/wordprocessingDrawing" xmlns:w10="urn:schemas-microsoft-com:office:word" xmlns:w="http://schemas.openxmlformats.org/wordprocessingml/2006/main" xmlns:w14="http://schemas.microsoft.com/office/word/2010/wordml" xmlns:w15="http://schemas.microsoft.com/office/word/2012/wordml" xmlns:w16cex="http://schemas.microsoft.com/office/word/2018/wordml/cex" xmlns:w16cid="http://schemas.microsoft.com/office/word/2016/wordml/cid" xmlns:w16="http://schemas.microsoft.com/office/word/2018/wordml" xmlns:w16du="http://schemas.microsoft.com/office/word/2023/wordml/word16du" xmlns:w16sdtdh="http://schemas.microsoft.com/office/word/2020/wordml/sdtdatahash" xmlns:w16sdtfl="http://schemas.microsoft.com/office/word/2024/wordml/sdtformatlock" xmlns:w16se="http://schemas.microsoft.com/office/word/2015/wordml/symex" xmlns:wpg="http://schemas.microsoft.com/office/word/2010/wordprocessingGroup" xmlns:wpi="http://schemas.microsoft.com/office/word/2010/wordprocessingInk" xmlns:wne="http://schemas.microsoft.com/office/word/2006/wordml" xmlns:wps="http://schemas.microsoft.com/office/word/2010/wordprocessingShape" mc:Ignorable="w14 w15 w16se w16cid w16 w16cex w16sdtdh w16sdtfl w16du wp14">
   <w:body>
-    <w:p/>
+    <w:p>
+      <w:pPr>
+        <w:rPr>
+          <w:sz w:val="28"/>
+          <w:szCs w:val="28"/>
+        </w:rPr>
+      </w:pPr>
+      <w:r>
+        <w:rPr>
+          <w:sz w:val="28"/>
+          <w:szCs w:val="28"/>
+        </w:rPr>
+        <w:t xml:space="preserve">Link </w:t>
+      </w:r>
+      <w:proofErr w:type="spellStart"/>
+      <w:r>
+        <w:rPr>
+          <w:sz w:val="28"/>
+          <w:szCs w:val="28"/>
+        </w:rPr>
+        <w:t>Github</w:t>
+      </w:r>
+      <w:proofErr w:type="spellEnd"/>
+      <w:r>
+        <w:rPr>
+          <w:sz w:val="28"/>
+          <w:szCs w:val="28"/>
+        </w:rPr>
+        <w:t xml:space="preserve">: </w:t>
+      </w:r>
+      <w:hyperlink r:id="rId5" w:history="1">
+        <w:r>
+          <w:rPr>
+            <w:rStyle w:val="Hyperlink"/>
+            <w:sz w:val="28"/>
+            <w:szCs w:val="28"/>
+          </w:rPr>
+          <w:t>https://github.com/SushiDotRoll/KPL_TPModul4</w:t>
+        </w:r>
+      </w:hyperlink>
+    </w:p>
+    <w:p>
+      <w:pPr>
+        <w:rPr>
+          <w:sz w:val="28"/>
+          <w:szCs w:val="28"/>
+        </w:rPr>
+      </w:pPr>
+      <w:r>
+        <w:rPr>
+          <w:sz w:val="28"/>
+          <w:szCs w:val="28"/>
+        </w:rPr>
+        <w:t>Hasil run:</w:t>
+      </w:r>
+    </w:p>
+    <w:p>
+      <w:pPr>
+        <w:rPr>
+          <w:sz w:val="28"/>
+          <w:szCs w:val="28"/>
+        </w:rPr>
+      </w:pPr>
+      <w:r>
+        <w:rPr>
+          <w:sz w:val="28"/>
+          <w:szCs w:val="28"/>
+        </w:rPr>
+        <w:drawing>
+          <wp:inline distT="0" distB="0" distL="0" distR="0" wp14:anchorId="239C825E" wp14:editId="0E8222D9">
+            <wp:extent cx="2178050" cy="3507808"/>
+            <wp:effectExtent l="0" t="0" r="0" b="0"/>
+            <wp:docPr id="790194975" name="Picture 1"/>
+            <wp:cNvGraphicFramePr>
+              <a:graphicFrameLocks xmlns:a="http://schemas.openxmlformats.org/drawingml/2006/main" noChangeAspect="1"/>
+            </wp:cNvGraphicFramePr>
+            <a:graphic xmlns:a="http://schemas.openxmlformats.org/drawingml/2006/main">
+              <a:graphicData uri="http://schemas.openxmlformats.org/drawingml/2006/picture">
+                <pic:pic xmlns:pic="http://schemas.openxmlformats.org/drawingml/2006/picture">
+                  <pic:nvPicPr>
+                    <pic:cNvPr id="790194975" name=""/>
+                    <pic:cNvPicPr/>
+                  </pic:nvPicPr>
+                  <pic:blipFill>
+                    <a:blip r:embed="rId6"/>
+                    <a:stretch>
+                      <a:fillRect/>
+                    </a:stretch>
+                  </pic:blipFill>
+                  <pic:spPr>
+                    <a:xfrm>
+                      <a:off x="0" y="0"/>
+                      <a:ext cx="2183874" cy="3517188"/>
+                    </a:xfrm>
+                    <a:prstGeom prst="rect">
+                      <a:avLst/>
+                    </a:prstGeom>
+                  </pic:spPr>
+                </pic:pic>
+              </a:graphicData>
+            </a:graphic>
+          </wp:inline>
+        </w:drawing>
+      </w:r>
+    </w:p>
+    <w:p>
+      <w:pPr>
+        <w:rPr>
+          <w:sz w:val="28"/>
+          <w:szCs w:val="28"/>
+        </w:rPr>
+      </w:pPr>
+      <w:proofErr w:type="spellStart"/>
+      <w:r>
+        <w:rPr>
+          <w:sz w:val="28"/>
+          <w:szCs w:val="28"/>
+        </w:rPr>
+        <w:t>Penjelasan</w:t>
+      </w:r>
+      <w:proofErr w:type="spellEnd"/>
+      <w:r>
+        <w:rPr>
+          <w:sz w:val="28"/>
+          <w:szCs w:val="28"/>
+        </w:rPr>
+        <w:t xml:space="preserve"> </w:t>
+      </w:r>
+      <w:proofErr w:type="spellStart"/>
+      <w:r>
+        <w:rPr>
+          <w:sz w:val="28"/>
+          <w:szCs w:val="28"/>
+        </w:rPr>
+        <w:t>singkat</w:t>
+      </w:r>
+      <w:proofErr w:type="spellEnd"/>
+      <w:r>
+        <w:rPr>
+          <w:sz w:val="28"/>
+          <w:szCs w:val="28"/>
+        </w:rPr>
+        <w:t xml:space="preserve"> </w:t>
+      </w:r>
+      <w:proofErr w:type="spellStart"/>
+      <w:r>
+        <w:rPr>
+          <w:sz w:val="28"/>
+          <w:szCs w:val="28"/>
+        </w:rPr>
+        <w:t>dari</w:t>
+      </w:r>
+      <w:proofErr w:type="spellEnd"/>
+      <w:r>
+        <w:rPr>
+          <w:sz w:val="28"/>
+          <w:szCs w:val="28"/>
+        </w:rPr>
+        <w:t xml:space="preserve"> </w:t>
+      </w:r>
+      <w:proofErr w:type="spellStart"/>
+      <w:r>
+        <w:rPr>
+          <w:sz w:val="28"/>
+          <w:szCs w:val="28"/>
+        </w:rPr>
+        <w:t>kode</w:t>
+      </w:r>
+      <w:proofErr w:type="spellEnd"/>
+      <w:r>
+        <w:rPr>
+          <w:sz w:val="28"/>
+          <w:szCs w:val="28"/>
+        </w:rPr>
+        <w:t xml:space="preserve"> </w:t>
+      </w:r>
+      <w:proofErr w:type="spellStart"/>
+      <w:r>
+        <w:rPr>
+          <w:sz w:val="28"/>
+          <w:szCs w:val="28"/>
+        </w:rPr>
+        <w:t>implementasi</w:t>
+      </w:r>
+      <w:proofErr w:type="spellEnd"/>
+      <w:r>
+        <w:rPr>
+          <w:sz w:val="28"/>
+          <w:szCs w:val="28"/>
+        </w:rPr>
+        <w:t xml:space="preserve"> </w:t>
+      </w:r>
+      <w:proofErr w:type="spellStart"/>
+      <w:r>
+        <w:rPr>
+          <w:sz w:val="28"/>
+          <w:szCs w:val="28"/>
+        </w:rPr>
+        <w:t>tugas</w:t>
+      </w:r>
+      <w:proofErr w:type="spellEnd"/>
+      <w:r>
+        <w:rPr>
+          <w:sz w:val="28"/>
+          <w:szCs w:val="28"/>
+        </w:rPr>
+        <w:t>:</w:t>
+      </w:r>
+    </w:p>
+    <w:p>
+      <w:pPr>
+        <w:pStyle w:val="ListParagraph"/>
+        <w:numPr>
+          <w:ilvl w:val="0"/>
+          <w:numId w:val="1"/>
+        </w:numPr>
+        <w:rPr>
+          <w:sz w:val="28"/>
+          <w:szCs w:val="28"/>
+        </w:rPr>
+      </w:pPr>
+      <w:proofErr w:type="spellStart"/>
+      <w:r>
+        <w:rPr>
+          <w:sz w:val="28"/>
+          <w:szCs w:val="28"/>
+        </w:rPr>
+        <w:t>Program.cs</w:t>
+      </w:r>
+      <w:proofErr w:type="spellEnd"/>
+    </w:p>
+    <w:p>
+      <w:pPr>
+        <w:pStyle w:val="ListParagraph"/>
+        <w:rPr>
+          <w:sz w:val="28"/>
+          <w:szCs w:val="28"/>
+        </w:rPr>
+      </w:pPr>
+      <w:r>
+        <w:rPr>
+          <w:sz w:val="28"/>
+          <w:szCs w:val="28"/>
+        </w:rPr>
+        <w:drawing>
+          <wp:inline distT="0" distB="0" distL="0" distR="0" wp14:anchorId="4D362C86" wp14:editId="09F0F0D0">
+            <wp:extent cx="3375355" cy="3778250"/>
+            <wp:effectExtent l="0" t="0" r="0" b="0"/>
+            <wp:docPr id="1782044292" name="Picture 1"/>
+            <wp:cNvGraphicFramePr>
+              <a:graphicFrameLocks xmlns:a="http://schemas.openxmlformats.org/drawingml/2006/main" noChangeAspect="1"/>
+            </wp:cNvGraphicFramePr>
+            <a:graphic xmlns:a="http://schemas.openxmlformats.org/drawingml/2006/main">
+              <a:graphicData uri="http://schemas.openxmlformats.org/drawingml/2006/picture">
+                <pic:pic xmlns:pic="http://schemas.openxmlformats.org/drawingml/2006/picture">
+                  <pic:nvPicPr>
+                    <pic:cNvPr id="1782044292" name=""/>
+                    <pic:cNvPicPr/>
+                  </pic:nvPicPr>
+                  <pic:blipFill>
+                    <a:blip r:embed="rId7"/>
+                    <a:stretch>
+                      <a:fillRect/>
+                    </a:stretch>
+                  </pic:blipFill>
+                  <pic:spPr>
+                    <a:xfrm>
+                      <a:off x="0" y="0"/>
+                      <a:ext cx="3389288" cy="3793847"/>
+                    </a:xfrm>
+                    <a:prstGeom prst="rect">
+                      <a:avLst/>
+                    </a:prstGeom>
+                  </pic:spPr>
+                </pic:pic>
+              </a:graphicData>
+            </a:graphic>
+          </wp:inline>
+        </w:drawing>
+      </w:r>
+    </w:p>
+    <w:p>
+      <w:pPr>
+        <w:pStyle w:val="ListParagraph"/>
+        <w:rPr>
+          <w:sz w:val="28"/>
+          <w:szCs w:val="28"/>
+        </w:rPr>
+      </w:pPr>
+      <w:r>
+        <w:rPr>
+          <w:sz w:val="28"/>
+          <w:szCs w:val="28"/>
+        </w:rPr>
+        <w:lastRenderedPageBreak/>
+        <w:t xml:space="preserve">Method </w:t>
+      </w:r>
+      <w:proofErr w:type="spellStart"/>
+      <w:r>
+        <w:rPr>
+          <w:sz w:val="28"/>
+          <w:szCs w:val="28"/>
+        </w:rPr>
+        <w:t>digunakan</w:t>
+      </w:r>
+      <w:proofErr w:type="spellEnd"/>
+      <w:r>
+        <w:rPr>
+          <w:sz w:val="28"/>
+          <w:szCs w:val="28"/>
+        </w:rPr>
+        <w:t xml:space="preserve"> </w:t>
+      </w:r>
+      <w:proofErr w:type="spellStart"/>
+      <w:r>
+        <w:rPr>
+          <w:sz w:val="28"/>
+          <w:szCs w:val="28"/>
+        </w:rPr>
+        <w:t>untuk</w:t>
+      </w:r>
+      <w:proofErr w:type="spellEnd"/>
+      <w:r>
+        <w:rPr>
+          <w:sz w:val="28"/>
+          <w:szCs w:val="28"/>
+        </w:rPr>
+        <w:t xml:space="preserve"> </w:t>
+      </w:r>
+      <w:proofErr w:type="spellStart"/>
+      <w:r>
+        <w:rPr>
+          <w:sz w:val="28"/>
+          <w:szCs w:val="28"/>
+        </w:rPr>
+        <w:t>menampilkan</w:t>
+      </w:r>
+      <w:proofErr w:type="spellEnd"/>
+      <w:r>
+        <w:rPr>
+          <w:sz w:val="28"/>
+          <w:szCs w:val="28"/>
+        </w:rPr>
+        <w:t xml:space="preserve"> daftar </w:t>
+      </w:r>
+      <w:proofErr w:type="spellStart"/>
+      <w:r>
+        <w:rPr>
+          <w:sz w:val="28"/>
+          <w:szCs w:val="28"/>
+        </w:rPr>
+        <w:t>kelurahan</w:t>
+      </w:r>
+      <w:proofErr w:type="spellEnd"/>
+      <w:r>
+        <w:rPr>
+          <w:sz w:val="28"/>
+          <w:szCs w:val="28"/>
+        </w:rPr>
+        <w:t xml:space="preserve"> </w:t>
+      </w:r>
+      <w:r>
+        <w:rPr>
+          <w:sz w:val="28"/>
+          <w:szCs w:val="28"/>
+        </w:rPr>
+        <w:t>dan</w:t>
+      </w:r>
+      <w:r>
+        <w:rPr>
+          <w:sz w:val="28"/>
+          <w:szCs w:val="28"/>
+        </w:rPr>
+        <w:t xml:space="preserve"> </w:t>
+      </w:r>
+      <w:proofErr w:type="spellStart"/>
+      <w:r>
+        <w:rPr>
+          <w:sz w:val="28"/>
+          <w:szCs w:val="28"/>
+        </w:rPr>
+        <w:t>kode</w:t>
+      </w:r>
+      <w:proofErr w:type="spellEnd"/>
+      <w:r>
+        <w:rPr>
+          <w:sz w:val="28"/>
+          <w:szCs w:val="28"/>
+        </w:rPr>
+        <w:t xml:space="preserve"> </w:t>
+      </w:r>
+      <w:proofErr w:type="spellStart"/>
+      <w:r>
+        <w:rPr>
+          <w:sz w:val="28"/>
+          <w:szCs w:val="28"/>
+        </w:rPr>
+        <w:t>posnya</w:t>
+      </w:r>
+      <w:proofErr w:type="spellEnd"/>
+      <w:r>
+        <w:rPr>
+          <w:sz w:val="28"/>
+          <w:szCs w:val="28"/>
+        </w:rPr>
+        <w:t xml:space="preserve">. </w:t>
+      </w:r>
+      <w:proofErr w:type="spellStart"/>
+      <w:r>
+        <w:rPr>
+          <w:sz w:val="28"/>
+          <w:szCs w:val="28"/>
+        </w:rPr>
+        <w:t>Variabel</w:t>
+      </w:r>
+      <w:proofErr w:type="spellEnd"/>
+      <w:r>
+        <w:rPr>
+          <w:sz w:val="28"/>
+          <w:szCs w:val="28"/>
+        </w:rPr>
+        <w:t xml:space="preserve"> data </w:t>
+      </w:r>
+      <w:proofErr w:type="spellStart"/>
+      <w:r>
+        <w:rPr>
+          <w:sz w:val="28"/>
+          <w:szCs w:val="28"/>
+        </w:rPr>
+        <w:t>merupakan</w:t>
+      </w:r>
+      <w:proofErr w:type="spellEnd"/>
+      <w:r>
+        <w:rPr>
+          <w:sz w:val="28"/>
+          <w:szCs w:val="28"/>
+        </w:rPr>
+        <w:t xml:space="preserve"> array yang meny</w:t>
+      </w:r>
+      <w:proofErr w:type="spellStart"/>
+      <w:r>
+        <w:rPr>
+          <w:sz w:val="28"/>
+          <w:szCs w:val="28"/>
+        </w:rPr>
+        <w:t>impan</w:t>
+      </w:r>
+      <w:proofErr w:type="spellEnd"/>
+      <w:r>
+        <w:rPr>
+          <w:sz w:val="28"/>
+          <w:szCs w:val="28"/>
+        </w:rPr>
+        <w:t xml:space="preserve"> </w:t>
+      </w:r>
+      <w:proofErr w:type="spellStart"/>
+      <w:r>
+        <w:rPr>
+          <w:sz w:val="28"/>
+          <w:szCs w:val="28"/>
+        </w:rPr>
+        <w:t>pasangan</w:t>
+      </w:r>
+      <w:proofErr w:type="spellEnd"/>
+      <w:r>
+        <w:rPr>
+          <w:sz w:val="28"/>
+          <w:szCs w:val="28"/>
+        </w:rPr>
+        <w:t xml:space="preserve"> </w:t>
+      </w:r>
+      <w:r>
+        <w:rPr>
+          <w:sz w:val="28"/>
+          <w:szCs w:val="28"/>
+        </w:rPr>
+        <w:t>n</w:t>
+      </w:r>
+      <w:r>
+        <w:rPr>
+          <w:sz w:val="28"/>
+          <w:szCs w:val="28"/>
+        </w:rPr>
+        <w:t xml:space="preserve">ama </w:t>
+      </w:r>
+      <w:proofErr w:type="spellStart"/>
+      <w:r>
+        <w:rPr>
+          <w:sz w:val="28"/>
+          <w:szCs w:val="28"/>
+        </w:rPr>
+        <w:t>kelurahan</w:t>
+      </w:r>
+      <w:proofErr w:type="spellEnd"/>
+      <w:r>
+        <w:rPr>
+          <w:sz w:val="28"/>
+          <w:szCs w:val="28"/>
+        </w:rPr>
+        <w:t xml:space="preserve"> </w:t>
+      </w:r>
+      <w:r>
+        <w:rPr>
+          <w:sz w:val="28"/>
+          <w:szCs w:val="28"/>
+        </w:rPr>
+        <w:t xml:space="preserve">dan </w:t>
+      </w:r>
+      <w:proofErr w:type="spellStart"/>
+      <w:r>
+        <w:rPr>
+          <w:sz w:val="28"/>
+          <w:szCs w:val="28"/>
+        </w:rPr>
+        <w:t>k</w:t>
+      </w:r>
+      <w:r>
+        <w:rPr>
+          <w:sz w:val="28"/>
+          <w:szCs w:val="28"/>
+        </w:rPr>
+        <w:t>ode</w:t>
+      </w:r>
+      <w:proofErr w:type="spellEnd"/>
+      <w:r>
+        <w:rPr>
+          <w:sz w:val="28"/>
+          <w:szCs w:val="28"/>
+        </w:rPr>
+        <w:t xml:space="preserve"> </w:t>
+      </w:r>
+      <w:proofErr w:type="spellStart"/>
+      <w:r>
+        <w:rPr>
+          <w:sz w:val="28"/>
+          <w:szCs w:val="28"/>
+        </w:rPr>
+        <w:t>pos</w:t>
+      </w:r>
+      <w:r>
+        <w:rPr>
+          <w:sz w:val="28"/>
+          <w:szCs w:val="28"/>
+        </w:rPr>
+        <w:t>nya</w:t>
+      </w:r>
+      <w:proofErr w:type="spellEnd"/>
+      <w:r>
+        <w:rPr>
+          <w:sz w:val="28"/>
+          <w:szCs w:val="28"/>
+        </w:rPr>
+        <w:t>.</w:t>
+      </w:r>
+    </w:p>
+    <w:p>
+      <w:pPr>
+        <w:pStyle w:val="ListParagraph"/>
+        <w:rPr>
+          <w:sz w:val="28"/>
+          <w:szCs w:val="28"/>
+        </w:rPr>
+      </w:pPr>
+      <w:r>
+        <w:rPr>
+          <w:sz w:val="28"/>
+          <w:szCs w:val="28"/>
+        </w:rPr>
+        <w:drawing>
+          <wp:inline distT="0" distB="0" distL="0" distR="0" wp14:anchorId="579D16BB" wp14:editId="3ED61390">
+            <wp:extent cx="5731510" cy="1368425"/>
+            <wp:effectExtent l="0" t="0" r="2540" b="3175"/>
+            <wp:docPr id="1667503778" name="Picture 1"/>
+            <wp:cNvGraphicFramePr>
+              <a:graphicFrameLocks xmlns:a="http://schemas.openxmlformats.org/drawingml/2006/main" noChangeAspect="1"/>
+            </wp:cNvGraphicFramePr>
+            <a:graphic xmlns:a="http://schemas.openxmlformats.org/drawingml/2006/main">
+              <a:graphicData uri="http://schemas.openxmlformats.org/drawingml/2006/picture">
+                <pic:pic xmlns:pic="http://schemas.openxmlformats.org/drawingml/2006/picture">
+                  <pic:nvPicPr>
+                    <pic:cNvPr id="1667503778" name=""/>
+                    <pic:cNvPicPr/>
+                  </pic:nvPicPr>
+                  <pic:blipFill>
+                    <a:blip r:embed="rId8"/>
+                    <a:stretch>
+                      <a:fillRect/>
+                    </a:stretch>
+                  </pic:blipFill>
+                  <pic:spPr>
+                    <a:xfrm>
+                      <a:off x="0" y="0"/>
+                      <a:ext cx="5731510" cy="1368425"/>
+                    </a:xfrm>
+                    <a:prstGeom prst="rect">
+                      <a:avLst/>
+                    </a:prstGeom>
+                  </pic:spPr>
+                </pic:pic>
+              </a:graphicData>
+            </a:graphic>
+          </wp:inline>
+        </w:drawing>
+      </w:r>
+    </w:p>
+    <w:p>
+      <w:pPr>
+        <w:pStyle w:val="ListParagraph"/>
+        <w:rPr>
+          <w:sz w:val="28"/>
+          <w:szCs w:val="28"/>
+        </w:rPr>
+      </w:pPr>
+      <w:r>
+        <w:rPr>
+          <w:sz w:val="28"/>
+          <w:szCs w:val="28"/>
+        </w:rPr>
+        <w:t xml:space="preserve">Program </w:t>
+      </w:r>
+      <w:proofErr w:type="spellStart"/>
+      <w:r>
+        <w:rPr>
+          <w:sz w:val="28"/>
+          <w:szCs w:val="28"/>
+        </w:rPr>
+        <w:t>kemudian</w:t>
+      </w:r>
+      <w:proofErr w:type="spellEnd"/>
+      <w:r>
+        <w:rPr>
+          <w:sz w:val="28"/>
+          <w:szCs w:val="28"/>
+        </w:rPr>
+        <w:t xml:space="preserve"> </w:t>
+      </w:r>
+      <w:proofErr w:type="spellStart"/>
+      <w:r>
+        <w:rPr>
+          <w:sz w:val="28"/>
+          <w:szCs w:val="28"/>
+        </w:rPr>
+        <w:t>akan</w:t>
+      </w:r>
+      <w:proofErr w:type="spellEnd"/>
+      <w:r>
+        <w:rPr>
+          <w:sz w:val="28"/>
+          <w:szCs w:val="28"/>
+        </w:rPr>
+        <w:t xml:space="preserve"> </w:t>
+      </w:r>
+      <w:proofErr w:type="spellStart"/>
+      <w:r>
+        <w:rPr>
+          <w:sz w:val="28"/>
+          <w:szCs w:val="28"/>
+        </w:rPr>
+        <w:t>menampilkan</w:t>
+      </w:r>
+      <w:proofErr w:type="spellEnd"/>
+      <w:r>
+        <w:rPr>
+          <w:sz w:val="28"/>
+          <w:szCs w:val="28"/>
+        </w:rPr>
+        <w:t xml:space="preserve"> </w:t>
+      </w:r>
+      <w:proofErr w:type="spellStart"/>
+      <w:r>
+        <w:rPr>
+          <w:sz w:val="28"/>
+          <w:szCs w:val="28"/>
+        </w:rPr>
+        <w:t>judul</w:t>
+      </w:r>
+      <w:proofErr w:type="spellEnd"/>
+      <w:r>
+        <w:rPr>
+          <w:sz w:val="28"/>
+          <w:szCs w:val="28"/>
+        </w:rPr>
+        <w:t xml:space="preserve"> </w:t>
+      </w:r>
+      <w:proofErr w:type="spellStart"/>
+      <w:r>
+        <w:rPr>
+          <w:sz w:val="28"/>
+          <w:szCs w:val="28"/>
+        </w:rPr>
+        <w:t>kolom</w:t>
+      </w:r>
+      <w:proofErr w:type="spellEnd"/>
+      <w:r>
+        <w:rPr>
+          <w:sz w:val="28"/>
+          <w:szCs w:val="28"/>
+        </w:rPr>
+        <w:t xml:space="preserve"> </w:t>
+      </w:r>
+      <w:proofErr w:type="spellStart"/>
+      <w:r>
+        <w:rPr>
+          <w:sz w:val="28"/>
+          <w:szCs w:val="28"/>
+        </w:rPr>
+        <w:t>tabel</w:t>
+      </w:r>
+      <w:proofErr w:type="spellEnd"/>
+      <w:r>
+        <w:rPr>
+          <w:sz w:val="28"/>
+          <w:szCs w:val="28"/>
+        </w:rPr>
+        <w:t>.</w:t>
+      </w:r>
+      <w:r>
+        <w:rPr>
+          <w:sz w:val="28"/>
+          <w:szCs w:val="28"/>
+        </w:rPr>
+        <w:t xml:space="preserve"> </w:t>
+      </w:r>
+      <w:r>
+        <w:rPr>
+          <w:sz w:val="28"/>
+          <w:szCs w:val="28"/>
+        </w:rPr>
+        <w:t>Format {</w:t>
+      </w:r>
+      <w:proofErr w:type="gramStart"/>
+      <w:r>
+        <w:rPr>
+          <w:sz w:val="28"/>
+          <w:szCs w:val="28"/>
+        </w:rPr>
+        <w:t>0,-</w:t>
+      </w:r>
+      <w:proofErr w:type="gramEnd"/>
+      <w:r>
+        <w:rPr>
+          <w:sz w:val="28"/>
+          <w:szCs w:val="28"/>
+        </w:rPr>
+        <w:t xml:space="preserve">15} </w:t>
+      </w:r>
+      <w:proofErr w:type="spellStart"/>
+      <w:r>
+        <w:rPr>
+          <w:sz w:val="28"/>
+          <w:szCs w:val="28"/>
+        </w:rPr>
+        <w:t>digunakan</w:t>
+      </w:r>
+      <w:proofErr w:type="spellEnd"/>
+      <w:r>
+        <w:rPr>
+          <w:sz w:val="28"/>
+          <w:szCs w:val="28"/>
+        </w:rPr>
+        <w:t xml:space="preserve"> </w:t>
+      </w:r>
+      <w:proofErr w:type="spellStart"/>
+      <w:r>
+        <w:rPr>
+          <w:sz w:val="28"/>
+          <w:szCs w:val="28"/>
+        </w:rPr>
+        <w:t>untuk</w:t>
+      </w:r>
+      <w:proofErr w:type="spellEnd"/>
+      <w:r>
+        <w:rPr>
+          <w:sz w:val="28"/>
+          <w:szCs w:val="28"/>
+        </w:rPr>
+        <w:t xml:space="preserve"> </w:t>
+      </w:r>
+      <w:proofErr w:type="spellStart"/>
+      <w:r>
+        <w:rPr>
+          <w:sz w:val="28"/>
+          <w:szCs w:val="28"/>
+        </w:rPr>
+        <w:t>mengatur</w:t>
+      </w:r>
+      <w:proofErr w:type="spellEnd"/>
+      <w:r>
+        <w:rPr>
+          <w:sz w:val="28"/>
+          <w:szCs w:val="28"/>
+        </w:rPr>
+        <w:t xml:space="preserve"> </w:t>
+      </w:r>
+      <w:proofErr w:type="spellStart"/>
+      <w:r>
+        <w:rPr>
+          <w:sz w:val="28"/>
+          <w:szCs w:val="28"/>
+        </w:rPr>
+        <w:t>lebar</w:t>
+      </w:r>
+      <w:proofErr w:type="spellEnd"/>
+      <w:r>
+        <w:rPr>
+          <w:sz w:val="28"/>
+          <w:szCs w:val="28"/>
+        </w:rPr>
+        <w:t xml:space="preserve"> </w:t>
+      </w:r>
+      <w:proofErr w:type="spellStart"/>
+      <w:r>
+        <w:rPr>
+          <w:sz w:val="28"/>
+          <w:szCs w:val="28"/>
+        </w:rPr>
+        <w:t>kolom</w:t>
+      </w:r>
+      <w:proofErr w:type="spellEnd"/>
+      <w:r>
+        <w:rPr>
+          <w:sz w:val="28"/>
+          <w:szCs w:val="28"/>
+        </w:rPr>
+        <w:t xml:space="preserve"> agar output </w:t>
+      </w:r>
+      <w:proofErr w:type="spellStart"/>
+      <w:r>
+        <w:rPr>
+          <w:sz w:val="28"/>
+          <w:szCs w:val="28"/>
+        </w:rPr>
+        <w:t>menjadi</w:t>
+      </w:r>
+      <w:proofErr w:type="spellEnd"/>
+      <w:r>
+        <w:rPr>
+          <w:sz w:val="28"/>
+          <w:szCs w:val="28"/>
+        </w:rPr>
+        <w:t xml:space="preserve"> </w:t>
+      </w:r>
+      <w:proofErr w:type="spellStart"/>
+      <w:r>
+        <w:rPr>
+          <w:sz w:val="28"/>
+          <w:szCs w:val="28"/>
+        </w:rPr>
+        <w:t>rapi</w:t>
+      </w:r>
+      <w:proofErr w:type="spellEnd"/>
+      <w:r>
+        <w:rPr>
+          <w:sz w:val="28"/>
+          <w:szCs w:val="28"/>
+        </w:rPr>
+        <w:t>.</w:t>
+      </w:r>
+      <w:r>
+        <w:rPr>
+          <w:sz w:val="28"/>
+          <w:szCs w:val="28"/>
+        </w:rPr>
+        <w:t xml:space="preserve"> </w:t>
+      </w:r>
+      <w:proofErr w:type="spellStart"/>
+      <w:r>
+        <w:rPr>
+          <w:sz w:val="28"/>
+          <w:szCs w:val="28"/>
+        </w:rPr>
+        <w:t>Kemudian</w:t>
+      </w:r>
+      <w:proofErr w:type="spellEnd"/>
+      <w:r>
+        <w:rPr>
+          <w:sz w:val="28"/>
+          <w:szCs w:val="28"/>
+        </w:rPr>
+        <w:t xml:space="preserve"> </w:t>
+      </w:r>
+      <w:proofErr w:type="spellStart"/>
+      <w:r>
+        <w:rPr>
+          <w:sz w:val="28"/>
+          <w:szCs w:val="28"/>
+        </w:rPr>
+        <w:t>akan</w:t>
+      </w:r>
+      <w:proofErr w:type="spellEnd"/>
+      <w:r>
+        <w:rPr>
+          <w:sz w:val="28"/>
+          <w:szCs w:val="28"/>
+        </w:rPr>
+        <w:t xml:space="preserve"> </w:t>
+      </w:r>
+      <w:proofErr w:type="spellStart"/>
+      <w:r>
+        <w:rPr>
+          <w:sz w:val="28"/>
+          <w:szCs w:val="28"/>
+        </w:rPr>
+        <w:t>dilakukan</w:t>
+      </w:r>
+      <w:proofErr w:type="spellEnd"/>
+      <w:r>
+        <w:rPr>
+          <w:sz w:val="28"/>
+          <w:szCs w:val="28"/>
+        </w:rPr>
+        <w:t xml:space="preserve"> </w:t>
+      </w:r>
+      <w:proofErr w:type="spellStart"/>
+      <w:r>
+        <w:rPr>
+          <w:sz w:val="28"/>
+          <w:szCs w:val="28"/>
+        </w:rPr>
+        <w:t>perulangan</w:t>
+      </w:r>
+      <w:proofErr w:type="spellEnd"/>
+      <w:r>
+        <w:rPr>
+          <w:sz w:val="28"/>
+          <w:szCs w:val="28"/>
+        </w:rPr>
+        <w:t xml:space="preserve"> </w:t>
+      </w:r>
+      <w:proofErr w:type="spellStart"/>
+      <w:r>
+        <w:rPr>
+          <w:sz w:val="28"/>
+          <w:szCs w:val="28"/>
+        </w:rPr>
+        <w:t>untuk</w:t>
+      </w:r>
+      <w:proofErr w:type="spellEnd"/>
+      <w:r>
+        <w:rPr>
+          <w:sz w:val="28"/>
+          <w:szCs w:val="28"/>
+        </w:rPr>
+        <w:t xml:space="preserve"> </w:t>
+      </w:r>
+      <w:proofErr w:type="spellStart"/>
+      <w:r>
+        <w:rPr>
+          <w:sz w:val="28"/>
+          <w:szCs w:val="28"/>
+        </w:rPr>
+        <w:t>mengakses</w:t>
+      </w:r>
+      <w:proofErr w:type="spellEnd"/>
+      <w:r>
+        <w:rPr>
+          <w:sz w:val="28"/>
+          <w:szCs w:val="28"/>
+        </w:rPr>
+        <w:t xml:space="preserve"> </w:t>
+      </w:r>
+      <w:proofErr w:type="spellStart"/>
+      <w:r>
+        <w:rPr>
+          <w:sz w:val="28"/>
+          <w:szCs w:val="28"/>
+        </w:rPr>
+        <w:t>setiap</w:t>
+      </w:r>
+      <w:proofErr w:type="spellEnd"/>
+      <w:r>
+        <w:rPr>
+          <w:sz w:val="28"/>
+          <w:szCs w:val="28"/>
+        </w:rPr>
+        <w:t xml:space="preserve"> baris data </w:t>
+      </w:r>
+      <w:proofErr w:type="spellStart"/>
+      <w:r>
+        <w:rPr>
+          <w:sz w:val="28"/>
+          <w:szCs w:val="28"/>
+        </w:rPr>
+        <w:t>dalam</w:t>
+      </w:r>
+      <w:proofErr w:type="spellEnd"/>
+      <w:r>
+        <w:rPr>
+          <w:sz w:val="28"/>
+          <w:szCs w:val="28"/>
+        </w:rPr>
+        <w:t xml:space="preserve"> array.</w:t>
+      </w:r>
+      <w:r>
+        <w:rPr>
+          <w:sz w:val="28"/>
+          <w:szCs w:val="28"/>
+        </w:rPr>
+        <w:t xml:space="preserve"> </w:t>
+      </w:r>
+      <w:proofErr w:type="spellStart"/>
+      <w:r>
+        <w:rPr>
+          <w:sz w:val="28"/>
+          <w:szCs w:val="28"/>
+        </w:rPr>
+        <w:t>Kemudian</w:t>
+      </w:r>
+      <w:proofErr w:type="spellEnd"/>
+      <w:r>
+        <w:rPr>
+          <w:sz w:val="28"/>
+          <w:szCs w:val="28"/>
+        </w:rPr>
+        <w:t xml:space="preserve"> program</w:t>
+      </w:r>
+      <w:r>
+        <w:rPr>
+          <w:sz w:val="28"/>
+          <w:szCs w:val="28"/>
+        </w:rPr>
+        <w:t xml:space="preserve"> </w:t>
+      </w:r>
+      <w:proofErr w:type="spellStart"/>
+      <w:r>
+        <w:rPr>
+          <w:sz w:val="28"/>
+          <w:szCs w:val="28"/>
+        </w:rPr>
+        <w:t>akan</w:t>
+      </w:r>
+      <w:proofErr w:type="spellEnd"/>
+      <w:r>
+        <w:rPr>
+          <w:sz w:val="28"/>
+          <w:szCs w:val="28"/>
+        </w:rPr>
+        <w:t xml:space="preserve"> </w:t>
+      </w:r>
+      <w:proofErr w:type="spellStart"/>
+      <w:r>
+        <w:rPr>
+          <w:sz w:val="28"/>
+          <w:szCs w:val="28"/>
+        </w:rPr>
+        <w:t>menampilkan</w:t>
+      </w:r>
+      <w:proofErr w:type="spellEnd"/>
+      <w:r>
+        <w:rPr>
+          <w:sz w:val="28"/>
+          <w:szCs w:val="28"/>
+        </w:rPr>
+        <w:t xml:space="preserve"> </w:t>
+      </w:r>
+      <w:r>
+        <w:rPr>
+          <w:sz w:val="28"/>
+          <w:szCs w:val="28"/>
+        </w:rPr>
+        <w:t xml:space="preserve">data[i,0] </w:t>
+      </w:r>
+      <w:proofErr w:type="spellStart"/>
+      <w:r>
+        <w:rPr>
+          <w:sz w:val="28"/>
+          <w:szCs w:val="28"/>
+        </w:rPr>
+        <w:t>untuk</w:t>
+      </w:r>
+      <w:proofErr w:type="spellEnd"/>
+      <w:r>
+        <w:rPr>
+          <w:sz w:val="28"/>
+          <w:szCs w:val="28"/>
+        </w:rPr>
+        <w:t xml:space="preserve"> nama </w:t>
+      </w:r>
+      <w:proofErr w:type="spellStart"/>
+      <w:r>
+        <w:rPr>
+          <w:sz w:val="28"/>
+          <w:szCs w:val="28"/>
+        </w:rPr>
+        <w:t>kelurahan</w:t>
+      </w:r>
+      <w:proofErr w:type="spellEnd"/>
+      <w:r>
+        <w:rPr>
+          <w:sz w:val="28"/>
+          <w:szCs w:val="28"/>
+        </w:rPr>
+        <w:t xml:space="preserve"> dan </w:t>
+      </w:r>
+      <w:r>
+        <w:rPr>
+          <w:sz w:val="28"/>
+          <w:szCs w:val="28"/>
+        </w:rPr>
+        <w:t xml:space="preserve">data[i,1] </w:t>
+      </w:r>
+      <w:proofErr w:type="spellStart"/>
+      <w:r>
+        <w:rPr>
+          <w:sz w:val="28"/>
+          <w:szCs w:val="28"/>
+        </w:rPr>
+        <w:t>untuk</w:t>
+      </w:r>
+      <w:proofErr w:type="spellEnd"/>
+      <w:r>
+        <w:rPr>
+          <w:sz w:val="28"/>
+          <w:szCs w:val="28"/>
+        </w:rPr>
+        <w:t xml:space="preserve"> </w:t>
+      </w:r>
+      <w:proofErr w:type="spellStart"/>
+      <w:r>
+        <w:rPr>
+          <w:sz w:val="28"/>
+          <w:szCs w:val="28"/>
+        </w:rPr>
+        <w:t>kode</w:t>
+      </w:r>
+      <w:proofErr w:type="spellEnd"/>
+      <w:r>
+        <w:rPr>
+          <w:sz w:val="28"/>
+          <w:szCs w:val="28"/>
+        </w:rPr>
+        <w:t xml:space="preserve"> </w:t>
+      </w:r>
+      <w:proofErr w:type="spellStart"/>
+      <w:r>
+        <w:rPr>
+          <w:sz w:val="28"/>
+          <w:szCs w:val="28"/>
+        </w:rPr>
+        <w:t>pos</w:t>
+      </w:r>
+      <w:proofErr w:type="spellEnd"/>
+      <w:r>
+        <w:rPr>
+          <w:sz w:val="28"/>
+          <w:szCs w:val="28"/>
+        </w:rPr>
+        <w:t xml:space="preserve"> </w:t>
+      </w:r>
+      <w:proofErr w:type="spellStart"/>
+      <w:r>
+        <w:rPr>
+          <w:sz w:val="28"/>
+          <w:szCs w:val="28"/>
+        </w:rPr>
+        <w:t>dengan</w:t>
+      </w:r>
+      <w:proofErr w:type="spellEnd"/>
+      <w:r>
+        <w:rPr>
+          <w:sz w:val="28"/>
+          <w:szCs w:val="28"/>
+        </w:rPr>
+        <w:t xml:space="preserve"> format </w:t>
+      </w:r>
+      <w:proofErr w:type="spellStart"/>
+      <w:r>
+        <w:rPr>
+          <w:sz w:val="28"/>
+          <w:szCs w:val="28"/>
+        </w:rPr>
+        <w:t>tabel</w:t>
+      </w:r>
+      <w:proofErr w:type="spellEnd"/>
+      <w:r>
+        <w:rPr>
+          <w:sz w:val="28"/>
+          <w:szCs w:val="28"/>
+        </w:rPr>
+        <w:t xml:space="preserve"> agar </w:t>
+      </w:r>
+      <w:proofErr w:type="spellStart"/>
+      <w:r>
+        <w:rPr>
+          <w:sz w:val="28"/>
+          <w:szCs w:val="28"/>
+        </w:rPr>
+        <w:t>hasil</w:t>
+      </w:r>
+      <w:proofErr w:type="spellEnd"/>
+      <w:r>
+        <w:rPr>
+          <w:sz w:val="28"/>
+          <w:szCs w:val="28"/>
+        </w:rPr>
+        <w:t xml:space="preserve"> output </w:t>
+      </w:r>
+      <w:proofErr w:type="spellStart"/>
+      <w:r>
+        <w:rPr>
+          <w:sz w:val="28"/>
+          <w:szCs w:val="28"/>
+        </w:rPr>
+        <w:t>tersusun</w:t>
+      </w:r>
+      <w:proofErr w:type="spellEnd"/>
+      <w:r>
+        <w:rPr>
+          <w:sz w:val="28"/>
+          <w:szCs w:val="28"/>
+        </w:rPr>
+        <w:t xml:space="preserve"> </w:t>
+      </w:r>
+      <w:proofErr w:type="spellStart"/>
+      <w:r>
+        <w:rPr>
+          <w:sz w:val="28"/>
+          <w:szCs w:val="28"/>
+        </w:rPr>
+        <w:t>rapi</w:t>
+      </w:r>
+      <w:proofErr w:type="spellEnd"/>
+      <w:r>
+        <w:rPr>
+          <w:sz w:val="28"/>
+          <w:szCs w:val="28"/>
+        </w:rPr>
+        <w:t>.</w:t>
+      </w:r>
+    </w:p>
+    <w:p>
+      <w:pPr>
+        <w:pStyle w:val="ListParagraph"/>
+        <w:rPr>
+          <w:sz w:val="28"/>
+          <w:szCs w:val="28"/>
+        </w:rPr>
+      </w:pPr>
+      <w:r>
+        <w:rPr>
+          <w:sz w:val="28"/>
+          <w:szCs w:val="28"/>
+        </w:rPr>
+        <w:drawing>
+          <wp:inline distT="0" distB="0" distL="0" distR="0" wp14:anchorId="259EB3BF" wp14:editId="7BBC8399">
+            <wp:extent cx="4464050" cy="2391455"/>
+            <wp:effectExtent l="0" t="0" r="0" b="8890"/>
+            <wp:docPr id="1393106777" name="Picture 1"/>
+            <wp:cNvGraphicFramePr>
+              <a:graphicFrameLocks xmlns:a="http://schemas.openxmlformats.org/drawingml/2006/main" noChangeAspect="1"/>
+            </wp:cNvGraphicFramePr>
+            <a:graphic xmlns:a="http://schemas.openxmlformats.org/drawingml/2006/main">
+              <a:graphicData uri="http://schemas.openxmlformats.org/drawingml/2006/picture">
+                <pic:pic xmlns:pic="http://schemas.openxmlformats.org/drawingml/2006/picture">
+                  <pic:nvPicPr>
+                    <pic:cNvPr id="1393106777" name=""/>
+                    <pic:cNvPicPr/>
+                  </pic:nvPicPr>
+                  <pic:blipFill>
+                    <a:blip r:embed="rId9"/>
+                    <a:stretch>
+                      <a:fillRect/>
+                    </a:stretch>
+                  </pic:blipFill>
+                  <pic:spPr>
+                    <a:xfrm>
+                      <a:off x="0" y="0"/>
+                      <a:ext cx="4473942" cy="2396754"/>
+                    </a:xfrm>
+                    <a:prstGeom prst="rect">
+                      <a:avLst/>
+                    </a:prstGeom>
+                  </pic:spPr>
+                </pic:pic>
+              </a:graphicData>
+            </a:graphic>
+          </wp:inline>
+        </w:drawing>
+      </w:r>
+    </w:p>
+    <w:p>
+      <w:pPr>
+        <w:pStyle w:val="ListParagraph"/>
+        <w:rPr>
+          <w:sz w:val="28"/>
+          <w:szCs w:val="28"/>
+        </w:rPr>
+      </w:pPr>
+      <w:r>
+        <w:rPr>
+          <w:sz w:val="28"/>
+          <w:szCs w:val="28"/>
+        </w:rPr>
+        <w:t xml:space="preserve">Program </w:t>
+      </w:r>
+      <w:proofErr w:type="spellStart"/>
+      <w:r>
+        <w:rPr>
+          <w:sz w:val="28"/>
+          <w:szCs w:val="28"/>
+        </w:rPr>
+        <w:t>pertama</w:t>
+      </w:r>
+      <w:proofErr w:type="spellEnd"/>
+      <w:r>
+        <w:rPr>
+          <w:sz w:val="28"/>
+          <w:szCs w:val="28"/>
+        </w:rPr>
+        <w:t xml:space="preserve"> </w:t>
+      </w:r>
+      <w:proofErr w:type="spellStart"/>
+      <w:r>
+        <w:rPr>
+          <w:sz w:val="28"/>
+          <w:szCs w:val="28"/>
+        </w:rPr>
+        <w:t>akan</w:t>
+      </w:r>
+      <w:proofErr w:type="spellEnd"/>
+      <w:r>
+        <w:rPr>
+          <w:sz w:val="28"/>
+          <w:szCs w:val="28"/>
+        </w:rPr>
+        <w:t xml:space="preserve"> </w:t>
+      </w:r>
+      <w:proofErr w:type="spellStart"/>
+      <w:r>
+        <w:rPr>
+          <w:sz w:val="28"/>
+          <w:szCs w:val="28"/>
+        </w:rPr>
+        <w:t>menjalankan</w:t>
+      </w:r>
+      <w:proofErr w:type="spellEnd"/>
+      <w:r>
+        <w:rPr>
+          <w:sz w:val="28"/>
+          <w:szCs w:val="28"/>
+        </w:rPr>
+        <w:t xml:space="preserve"> method yang </w:t>
+      </w:r>
+      <w:proofErr w:type="spellStart"/>
+      <w:r>
+        <w:rPr>
+          <w:sz w:val="28"/>
+          <w:szCs w:val="28"/>
+        </w:rPr>
+        <w:t>menampilkan</w:t>
+      </w:r>
+      <w:proofErr w:type="spellEnd"/>
+      <w:r>
+        <w:rPr>
+          <w:sz w:val="28"/>
+          <w:szCs w:val="28"/>
+        </w:rPr>
+        <w:t xml:space="preserve"> data </w:t>
+      </w:r>
+      <w:proofErr w:type="spellStart"/>
+      <w:r>
+        <w:rPr>
+          <w:sz w:val="28"/>
+          <w:szCs w:val="28"/>
+        </w:rPr>
+        <w:t>kelurahan</w:t>
+      </w:r>
+      <w:proofErr w:type="spellEnd"/>
+      <w:r>
+        <w:rPr>
+          <w:sz w:val="28"/>
+          <w:szCs w:val="28"/>
+        </w:rPr>
+        <w:t xml:space="preserve"> dan </w:t>
+      </w:r>
+      <w:proofErr w:type="spellStart"/>
+      <w:r>
+        <w:rPr>
+          <w:sz w:val="28"/>
+          <w:szCs w:val="28"/>
+        </w:rPr>
+        <w:t>kode</w:t>
+      </w:r>
+      <w:proofErr w:type="spellEnd"/>
+      <w:r>
+        <w:rPr>
+          <w:sz w:val="28"/>
+          <w:szCs w:val="28"/>
+        </w:rPr>
+        <w:t xml:space="preserve"> pos.</w:t>
+      </w:r>
+      <w:r>
+        <w:rPr>
+          <w:sz w:val="28"/>
+          <w:szCs w:val="28"/>
+        </w:rPr>
+        <w:t xml:space="preserve"> </w:t>
+      </w:r>
+      <w:proofErr w:type="spellStart"/>
+      <w:r>
+        <w:rPr>
+          <w:sz w:val="28"/>
+          <w:szCs w:val="28"/>
+        </w:rPr>
+        <w:t>Kemudian</w:t>
+      </w:r>
+      <w:proofErr w:type="spellEnd"/>
+      <w:r>
+        <w:rPr>
+          <w:sz w:val="28"/>
+          <w:szCs w:val="28"/>
+        </w:rPr>
+        <w:t xml:space="preserve"> </w:t>
+      </w:r>
+      <w:proofErr w:type="spellStart"/>
+      <w:r>
+        <w:rPr>
+          <w:sz w:val="28"/>
+          <w:szCs w:val="28"/>
+        </w:rPr>
+        <w:t>menampilkan</w:t>
+      </w:r>
+      <w:proofErr w:type="spellEnd"/>
+      <w:r>
+        <w:rPr>
+          <w:sz w:val="28"/>
+          <w:szCs w:val="28"/>
+        </w:rPr>
+        <w:t xml:space="preserve"> </w:t>
+      </w:r>
+      <w:proofErr w:type="spellStart"/>
+      <w:r>
+        <w:rPr>
+          <w:sz w:val="28"/>
+          <w:szCs w:val="28"/>
+        </w:rPr>
+        <w:t>teks</w:t>
+      </w:r>
+      <w:proofErr w:type="spellEnd"/>
+      <w:r>
+        <w:rPr>
+          <w:sz w:val="28"/>
+          <w:szCs w:val="28"/>
+        </w:rPr>
+        <w:t xml:space="preserve"> "</w:t>
+      </w:r>
+      <w:proofErr w:type="spellStart"/>
+      <w:r>
+        <w:rPr>
+          <w:sz w:val="28"/>
+          <w:szCs w:val="28"/>
+        </w:rPr>
+        <w:t>Simulasi</w:t>
+      </w:r>
+      <w:proofErr w:type="spellEnd"/>
+      <w:r>
+        <w:rPr>
+          <w:sz w:val="28"/>
+          <w:szCs w:val="28"/>
+        </w:rPr>
+        <w:t xml:space="preserve"> Door Machine" pada console</w:t>
+      </w:r>
+      <w:r>
+        <w:rPr>
+          <w:sz w:val="28"/>
+          <w:szCs w:val="28"/>
+        </w:rPr>
+        <w:t xml:space="preserve">. </w:t>
+      </w:r>
+      <w:proofErr w:type="spellStart"/>
+      <w:r>
+        <w:rPr>
+          <w:sz w:val="28"/>
+          <w:szCs w:val="28"/>
+        </w:rPr>
+        <w:t>Setelah</w:t>
+      </w:r>
+      <w:proofErr w:type="spellEnd"/>
+      <w:r>
+        <w:rPr>
+          <w:sz w:val="28"/>
+          <w:szCs w:val="28"/>
+        </w:rPr>
+        <w:t xml:space="preserve"> </w:t>
+      </w:r>
+      <w:proofErr w:type="spellStart"/>
+      <w:r>
+        <w:rPr>
+          <w:sz w:val="28"/>
+          <w:szCs w:val="28"/>
+        </w:rPr>
+        <w:t>itu</w:t>
+      </w:r>
+      <w:proofErr w:type="spellEnd"/>
+      <w:r>
+        <w:rPr>
+          <w:sz w:val="28"/>
+          <w:szCs w:val="28"/>
+        </w:rPr>
+        <w:t xml:space="preserve">, program </w:t>
+      </w:r>
+      <w:proofErr w:type="spellStart"/>
+      <w:r>
+        <w:rPr>
+          <w:sz w:val="28"/>
+          <w:szCs w:val="28"/>
+        </w:rPr>
+        <w:t>akan</w:t>
+      </w:r>
+      <w:proofErr w:type="spellEnd"/>
+      <w:r>
+        <w:rPr>
+          <w:sz w:val="28"/>
+          <w:szCs w:val="28"/>
+        </w:rPr>
+        <w:t xml:space="preserve"> </w:t>
+      </w:r>
+      <w:proofErr w:type="spellStart"/>
+      <w:r>
+        <w:rPr>
+          <w:sz w:val="28"/>
+          <w:szCs w:val="28"/>
+        </w:rPr>
+        <w:t>membuat</w:t>
+      </w:r>
+      <w:proofErr w:type="spellEnd"/>
+      <w:r>
+        <w:rPr>
+          <w:sz w:val="28"/>
+          <w:szCs w:val="28"/>
+        </w:rPr>
+        <w:t xml:space="preserve"> </w:t>
+      </w:r>
+      <w:proofErr w:type="spellStart"/>
+      <w:r>
+        <w:rPr>
+          <w:sz w:val="28"/>
+          <w:szCs w:val="28"/>
+        </w:rPr>
+        <w:t>objek</w:t>
+      </w:r>
+      <w:proofErr w:type="spellEnd"/>
+      <w:r>
+        <w:rPr>
+          <w:sz w:val="28"/>
+          <w:szCs w:val="28"/>
+        </w:rPr>
+        <w:t xml:space="preserve"> </w:t>
+      </w:r>
+      <w:proofErr w:type="spellStart"/>
+      <w:r>
+        <w:rPr>
+          <w:sz w:val="28"/>
+          <w:szCs w:val="28"/>
+        </w:rPr>
+        <w:t>baru</w:t>
+      </w:r>
+      <w:proofErr w:type="spellEnd"/>
+      <w:r>
+        <w:rPr>
+          <w:sz w:val="28"/>
+          <w:szCs w:val="28"/>
+        </w:rPr>
+        <w:t xml:space="preserve"> </w:t>
+      </w:r>
+      <w:proofErr w:type="spellStart"/>
+      <w:r>
+        <w:rPr>
+          <w:sz w:val="28"/>
+          <w:szCs w:val="28"/>
+        </w:rPr>
+        <w:t>dari</w:t>
+      </w:r>
+      <w:proofErr w:type="spellEnd"/>
+      <w:r>
+        <w:rPr>
+          <w:sz w:val="28"/>
+          <w:szCs w:val="28"/>
+        </w:rPr>
+        <w:t xml:space="preserve"> class </w:t>
+      </w:r>
+      <w:proofErr w:type="spellStart"/>
+      <w:r>
+        <w:rPr>
+          <w:sz w:val="28"/>
+          <w:szCs w:val="28"/>
+        </w:rPr>
+        <w:t>DoorMachine</w:t>
+      </w:r>
+      <w:proofErr w:type="spellEnd"/>
+      <w:r>
+        <w:rPr>
+          <w:sz w:val="28"/>
+          <w:szCs w:val="28"/>
+        </w:rPr>
+        <w:t xml:space="preserve"> </w:t>
+      </w:r>
+      <w:proofErr w:type="spellStart"/>
+      <w:r>
+        <w:rPr>
+          <w:sz w:val="28"/>
+          <w:szCs w:val="28"/>
+        </w:rPr>
+        <w:t>bernama</w:t>
+      </w:r>
+      <w:proofErr w:type="spellEnd"/>
+      <w:r>
+        <w:rPr>
+          <w:sz w:val="28"/>
+          <w:szCs w:val="28"/>
+        </w:rPr>
+        <w:t xml:space="preserve"> </w:t>
+      </w:r>
+      <w:proofErr w:type="spellStart"/>
+      <w:r>
+        <w:rPr>
+          <w:sz w:val="28"/>
+          <w:szCs w:val="28"/>
+        </w:rPr>
+        <w:t>pintu</w:t>
+      </w:r>
+      <w:proofErr w:type="spellEnd"/>
+      <w:r>
+        <w:rPr>
+          <w:sz w:val="28"/>
+          <w:szCs w:val="28"/>
+        </w:rPr>
+        <w:t>.</w:t>
+      </w:r>
+      <w:r>
+        <w:rPr>
+          <w:sz w:val="28"/>
+          <w:szCs w:val="28"/>
+        </w:rPr>
+        <w:t xml:space="preserve"> </w:t>
+      </w:r>
+      <w:r>
+        <w:rPr>
+          <w:sz w:val="28"/>
+          <w:szCs w:val="28"/>
+        </w:rPr>
+        <w:t>Ketika ob</w:t>
+      </w:r>
+      <w:proofErr w:type="spellStart"/>
+      <w:r>
+        <w:rPr>
+          <w:sz w:val="28"/>
+          <w:szCs w:val="28"/>
+        </w:rPr>
+        <w:t>jek</w:t>
+      </w:r>
+      <w:proofErr w:type="spellEnd"/>
+      <w:r>
+        <w:rPr>
+          <w:sz w:val="28"/>
+          <w:szCs w:val="28"/>
+        </w:rPr>
+        <w:t xml:space="preserve"> </w:t>
+      </w:r>
+      <w:proofErr w:type="spellStart"/>
+      <w:r>
+        <w:rPr>
+          <w:sz w:val="28"/>
+          <w:szCs w:val="28"/>
+        </w:rPr>
+        <w:t>dibuat</w:t>
+      </w:r>
+      <w:proofErr w:type="spellEnd"/>
+      <w:r>
+        <w:rPr>
+          <w:sz w:val="28"/>
+          <w:szCs w:val="28"/>
+        </w:rPr>
+        <w:t xml:space="preserve">, constructor </w:t>
+      </w:r>
+      <w:proofErr w:type="spellStart"/>
+      <w:r>
+        <w:rPr>
+          <w:sz w:val="28"/>
+          <w:szCs w:val="28"/>
+        </w:rPr>
+        <w:t>DoorMachine</w:t>
+      </w:r>
+      <w:proofErr w:type="spellEnd"/>
+      <w:r>
+        <w:rPr>
+          <w:sz w:val="28"/>
+          <w:szCs w:val="28"/>
+        </w:rPr>
+        <w:t xml:space="preserve"> </w:t>
+      </w:r>
+      <w:proofErr w:type="spellStart"/>
+      <w:r>
+        <w:rPr>
+          <w:sz w:val="28"/>
+          <w:szCs w:val="28"/>
+        </w:rPr>
+        <w:t>akan</w:t>
+      </w:r>
+      <w:proofErr w:type="spellEnd"/>
+      <w:r>
+        <w:rPr>
+          <w:sz w:val="28"/>
+          <w:szCs w:val="28"/>
+        </w:rPr>
+        <w:t xml:space="preserve"> </w:t>
+      </w:r>
+      <w:proofErr w:type="spellStart"/>
+      <w:r>
+        <w:rPr>
+          <w:sz w:val="28"/>
+          <w:szCs w:val="28"/>
+        </w:rPr>
+        <w:t>dijalankan</w:t>
+      </w:r>
+      <w:proofErr w:type="spellEnd"/>
+      <w:r>
+        <w:rPr>
+          <w:sz w:val="28"/>
+          <w:szCs w:val="28"/>
+        </w:rPr>
+        <w:t>.</w:t>
+      </w:r>
+      <w:r>
+        <w:rPr>
+          <w:sz w:val="28"/>
+          <w:szCs w:val="28"/>
+        </w:rPr>
+        <w:t xml:space="preserve"> </w:t>
+      </w:r>
+      <w:proofErr w:type="spellStart"/>
+      <w:r>
+        <w:rPr>
+          <w:sz w:val="28"/>
+          <w:szCs w:val="28"/>
+        </w:rPr>
+        <w:t>Kemudian</w:t>
+      </w:r>
+      <w:proofErr w:type="spellEnd"/>
+      <w:r>
+        <w:rPr>
+          <w:sz w:val="28"/>
+          <w:szCs w:val="28"/>
+        </w:rPr>
+        <w:t xml:space="preserve"> program </w:t>
+      </w:r>
+      <w:proofErr w:type="spellStart"/>
+      <w:r>
+        <w:rPr>
+          <w:sz w:val="28"/>
+          <w:szCs w:val="28"/>
+        </w:rPr>
+        <w:t>mensimulasikan</w:t>
+      </w:r>
+      <w:proofErr w:type="spellEnd"/>
+      <w:r>
+        <w:rPr>
+          <w:sz w:val="28"/>
+          <w:szCs w:val="28"/>
+        </w:rPr>
+        <w:t xml:space="preserve"> </w:t>
+      </w:r>
+      <w:proofErr w:type="spellStart"/>
+      <w:r>
+        <w:rPr>
+          <w:sz w:val="28"/>
+          <w:szCs w:val="28"/>
+        </w:rPr>
+        <w:t>perubahan</w:t>
+      </w:r>
+      <w:proofErr w:type="spellEnd"/>
+      <w:r>
+        <w:rPr>
+          <w:sz w:val="28"/>
+          <w:szCs w:val="28"/>
+        </w:rPr>
+        <w:t xml:space="preserve"> state </w:t>
+      </w:r>
+      <w:proofErr w:type="spellStart"/>
+      <w:r>
+        <w:rPr>
+          <w:sz w:val="28"/>
+          <w:szCs w:val="28"/>
+        </w:rPr>
+        <w:t>pintu</w:t>
+      </w:r>
+      <w:proofErr w:type="spellEnd"/>
+      <w:r>
+        <w:rPr>
+          <w:sz w:val="28"/>
+          <w:szCs w:val="28"/>
+        </w:rPr>
+        <w:t xml:space="preserve"> (</w:t>
+      </w:r>
+      <w:proofErr w:type="spellStart"/>
+      <w:r>
+        <w:rPr>
+          <w:sz w:val="28"/>
+          <w:szCs w:val="28"/>
+        </w:rPr>
+        <w:t>Membuka</w:t>
+      </w:r>
+      <w:proofErr w:type="spellEnd"/>
+      <w:r>
+        <w:rPr>
+          <w:sz w:val="28"/>
+          <w:szCs w:val="28"/>
+        </w:rPr>
+        <w:t xml:space="preserve"> </w:t>
+      </w:r>
+      <w:proofErr w:type="spellStart"/>
+      <w:r>
+        <w:rPr>
+          <w:sz w:val="28"/>
+          <w:szCs w:val="28"/>
+        </w:rPr>
+        <w:t>pintu</w:t>
+      </w:r>
+      <w:proofErr w:type="spellEnd"/>
+      <w:r>
+        <w:rPr>
+          <w:sz w:val="28"/>
+          <w:szCs w:val="28"/>
+        </w:rPr>
+        <w:t xml:space="preserve">, </w:t>
+      </w:r>
+      <w:proofErr w:type="spellStart"/>
+      <w:r>
+        <w:rPr>
+          <w:sz w:val="28"/>
+          <w:szCs w:val="28"/>
+        </w:rPr>
+        <w:t>Mengunci</w:t>
+      </w:r>
+      <w:proofErr w:type="spellEnd"/>
+      <w:r>
+        <w:rPr>
+          <w:sz w:val="28"/>
+          <w:szCs w:val="28"/>
+        </w:rPr>
+        <w:t xml:space="preserve"> </w:t>
+      </w:r>
+      <w:proofErr w:type="spellStart"/>
+      <w:r>
+        <w:rPr>
+          <w:sz w:val="28"/>
+          <w:szCs w:val="28"/>
+        </w:rPr>
+        <w:t>pintu</w:t>
+      </w:r>
+      <w:proofErr w:type="spellEnd"/>
+      <w:r>
+        <w:rPr>
+          <w:sz w:val="28"/>
+          <w:szCs w:val="28"/>
+        </w:rPr>
+        <w:t xml:space="preserve">, </w:t>
+      </w:r>
+      <w:proofErr w:type="spellStart"/>
+      <w:r>
+        <w:rPr>
+          <w:sz w:val="28"/>
+          <w:szCs w:val="28"/>
+        </w:rPr>
+        <w:t>Membuka</w:t>
+      </w:r>
+      <w:proofErr w:type="spellEnd"/>
+      <w:r>
+        <w:rPr>
+          <w:sz w:val="28"/>
+          <w:szCs w:val="28"/>
+        </w:rPr>
+        <w:t xml:space="preserve"> </w:t>
+      </w:r>
+      <w:proofErr w:type="spellStart"/>
+      <w:r>
+        <w:rPr>
+          <w:sz w:val="28"/>
+          <w:szCs w:val="28"/>
+        </w:rPr>
+        <w:t>kembali</w:t>
+      </w:r>
+      <w:proofErr w:type="spellEnd"/>
+      <w:r>
+        <w:rPr>
+          <w:sz w:val="28"/>
+          <w:szCs w:val="28"/>
+        </w:rPr>
+        <w:t xml:space="preserve"> </w:t>
+      </w:r>
+      <w:proofErr w:type="spellStart"/>
+      <w:r>
+        <w:rPr>
+          <w:sz w:val="28"/>
+          <w:szCs w:val="28"/>
+        </w:rPr>
+        <w:t>pintu</w:t>
+      </w:r>
+      <w:proofErr w:type="spellEnd"/>
+      <w:r>
+        <w:rPr>
+          <w:sz w:val="28"/>
+          <w:szCs w:val="28"/>
+        </w:rPr>
+        <w:t>).</w:t>
+      </w:r>
+    </w:p>
+    <w:p>
+      <w:pPr>
+        <w:pStyle w:val="ListParagraph"/>
+        <w:rPr>
+          <w:sz w:val="28"/>
+          <w:szCs w:val="28"/>
+        </w:rPr>
+      </w:pPr>
+    </w:p>
+    <w:p>
+      <w:pPr>
+        <w:pStyle w:val="ListParagraph"/>
+        <w:rPr>
+          <w:sz w:val="28"/>
+          <w:szCs w:val="28"/>
+        </w:rPr>
+      </w:pPr>
+    </w:p>
+    <w:p>
+      <w:pPr>
+        <w:pStyle w:val="ListParagraph"/>
+        <w:rPr>
+          <w:sz w:val="28"/>
+          <w:szCs w:val="28"/>
+        </w:rPr>
+      </w:pPr>
+    </w:p>
+    <w:p>
+      <w:pPr>
+        <w:pStyle w:val="ListParagraph"/>
+        <w:rPr>
+          <w:sz w:val="28"/>
+          <w:szCs w:val="28"/>
+        </w:rPr>
+      </w:pPr>
+    </w:p>
+    <w:p>
+      <w:pPr>
+        <w:pStyle w:val="ListParagraph"/>
+        <w:rPr>
+          <w:sz w:val="28"/>
+          <w:szCs w:val="28"/>
+        </w:rPr>
+      </w:pPr>
+    </w:p>
+    <w:p>
+      <w:pPr>
+        <w:pStyle w:val="ListParagraph"/>
+        <w:numPr>
+          <w:ilvl w:val="0"/>
+          <w:numId w:val="1"/>
+        </w:numPr>
+        <w:rPr>
+          <w:sz w:val="28"/>
+          <w:szCs w:val="28"/>
+        </w:rPr>
+      </w:pPr>
+      <w:proofErr w:type="spellStart"/>
+      <w:r>
+        <w:rPr>
+          <w:sz w:val="28"/>
+          <w:szCs w:val="28"/>
+        </w:rPr>
+        <w:lastRenderedPageBreak/>
+        <w:t>DoorMachine.cs</w:t>
+      </w:r>
+      <w:proofErr w:type="spellEnd"/>
+    </w:p>
+    <w:p>
+      <w:pPr>
+        <w:pStyle w:val="ListParagraph"/>
+        <w:rPr>
+          <w:sz w:val="28"/>
+          <w:szCs w:val="28"/>
+        </w:rPr>
+      </w:pPr>
+      <w:r>
+        <w:rPr>
+          <w:sz w:val="28"/>
+          <w:szCs w:val="28"/>
+        </w:rPr>
+        <w:drawing>
+          <wp:inline distT="0" distB="0" distL="0" distR="0" wp14:anchorId="499CFE62" wp14:editId="26D7D3CA">
+            <wp:extent cx="4515480" cy="1800476"/>
+            <wp:effectExtent l="0" t="0" r="0" b="9525"/>
+            <wp:docPr id="1943515502" name="Picture 1"/>
+            <wp:cNvGraphicFramePr>
+              <a:graphicFrameLocks xmlns:a="http://schemas.openxmlformats.org/drawingml/2006/main" noChangeAspect="1"/>
+            </wp:cNvGraphicFramePr>
+            <a:graphic xmlns:a="http://schemas.openxmlformats.org/drawingml/2006/main">
+              <a:graphicData uri="http://schemas.openxmlformats.org/drawingml/2006/picture">
+                <pic:pic xmlns:pic="http://schemas.openxmlformats.org/drawingml/2006/picture">
+                  <pic:nvPicPr>
+                    <pic:cNvPr id="1943515502" name=""/>
+                    <pic:cNvPicPr/>
+                  </pic:nvPicPr>
+                  <pic:blipFill>
+                    <a:blip r:embed="rId10"/>
+                    <a:stretch>
+                      <a:fillRect/>
+                    </a:stretch>
+                  </pic:blipFill>
+                  <pic:spPr>
+                    <a:xfrm>
+                      <a:off x="0" y="0"/>
+                      <a:ext cx="4515480" cy="1800476"/>
+                    </a:xfrm>
+                    <a:prstGeom prst="rect">
+                      <a:avLst/>
+                    </a:prstGeom>
+                  </pic:spPr>
+                </pic:pic>
+              </a:graphicData>
+            </a:graphic>
+          </wp:inline>
+        </w:drawing>
+      </w:r>
+    </w:p>
+    <w:p>
+      <w:pPr>
+        <w:pStyle w:val="ListParagraph"/>
+        <w:rPr>
+          <w:sz w:val="28"/>
+          <w:szCs w:val="28"/>
+        </w:rPr>
+      </w:pPr>
+      <w:r>
+        <w:rPr>
+          <w:sz w:val="28"/>
+          <w:szCs w:val="28"/>
+        </w:rPr>
+        <w:t xml:space="preserve">Program </w:t>
+      </w:r>
+      <w:proofErr w:type="spellStart"/>
+      <w:r>
+        <w:rPr>
+          <w:sz w:val="28"/>
+          <w:szCs w:val="28"/>
+        </w:rPr>
+        <w:t>membuat</w:t>
+      </w:r>
+      <w:proofErr w:type="spellEnd"/>
+      <w:r>
+        <w:rPr>
+          <w:sz w:val="28"/>
+          <w:szCs w:val="28"/>
+        </w:rPr>
+        <w:t xml:space="preserve"> </w:t>
+      </w:r>
+      <w:proofErr w:type="spellStart"/>
+      <w:r>
+        <w:rPr>
+          <w:sz w:val="28"/>
+          <w:szCs w:val="28"/>
+        </w:rPr>
+        <w:t>v</w:t>
+      </w:r>
+      <w:r>
+        <w:rPr>
+          <w:sz w:val="28"/>
+          <w:szCs w:val="28"/>
+        </w:rPr>
+        <w:t>ariabel</w:t>
+      </w:r>
+      <w:proofErr w:type="spellEnd"/>
+      <w:r>
+        <w:rPr>
+          <w:sz w:val="28"/>
+          <w:szCs w:val="28"/>
+        </w:rPr>
+        <w:t xml:space="preserve"> state </w:t>
+      </w:r>
+      <w:r>
+        <w:rPr>
+          <w:sz w:val="28"/>
+          <w:szCs w:val="28"/>
+        </w:rPr>
+        <w:t xml:space="preserve">yang </w:t>
+      </w:r>
+      <w:proofErr w:type="spellStart"/>
+      <w:r>
+        <w:rPr>
+          <w:sz w:val="28"/>
+          <w:szCs w:val="28"/>
+        </w:rPr>
+        <w:t>digunakan</w:t>
+      </w:r>
+      <w:proofErr w:type="spellEnd"/>
+      <w:r>
+        <w:rPr>
+          <w:sz w:val="28"/>
+          <w:szCs w:val="28"/>
+        </w:rPr>
+        <w:t xml:space="preserve"> </w:t>
+      </w:r>
+      <w:proofErr w:type="spellStart"/>
+      <w:r>
+        <w:rPr>
+          <w:sz w:val="28"/>
+          <w:szCs w:val="28"/>
+        </w:rPr>
+        <w:t>untuk</w:t>
+      </w:r>
+      <w:proofErr w:type="spellEnd"/>
+      <w:r>
+        <w:rPr>
+          <w:sz w:val="28"/>
+          <w:szCs w:val="28"/>
+        </w:rPr>
+        <w:t xml:space="preserve"> </w:t>
+      </w:r>
+      <w:proofErr w:type="spellStart"/>
+      <w:r>
+        <w:rPr>
+          <w:sz w:val="28"/>
+          <w:szCs w:val="28"/>
+        </w:rPr>
+        <w:t>menyimpan</w:t>
+      </w:r>
+      <w:proofErr w:type="spellEnd"/>
+      <w:r>
+        <w:rPr>
+          <w:sz w:val="28"/>
+          <w:szCs w:val="28"/>
+        </w:rPr>
+        <w:t xml:space="preserve"> </w:t>
+      </w:r>
+      <w:proofErr w:type="spellStart"/>
+      <w:r>
+        <w:rPr>
+          <w:sz w:val="28"/>
+          <w:szCs w:val="28"/>
+        </w:rPr>
+        <w:t>kondisi</w:t>
+      </w:r>
+      <w:proofErr w:type="spellEnd"/>
+      <w:r>
+        <w:rPr>
+          <w:sz w:val="28"/>
+          <w:szCs w:val="28"/>
+        </w:rPr>
+        <w:t xml:space="preserve"> </w:t>
+      </w:r>
+      <w:proofErr w:type="spellStart"/>
+      <w:r>
+        <w:rPr>
+          <w:sz w:val="28"/>
+          <w:szCs w:val="28"/>
+        </w:rPr>
+        <w:t>pintu</w:t>
+      </w:r>
+      <w:proofErr w:type="spellEnd"/>
+      <w:r>
+        <w:rPr>
+          <w:sz w:val="28"/>
+          <w:szCs w:val="28"/>
+        </w:rPr>
+        <w:t xml:space="preserve"> </w:t>
+      </w:r>
+      <w:proofErr w:type="spellStart"/>
+      <w:r>
+        <w:rPr>
+          <w:sz w:val="28"/>
+          <w:szCs w:val="28"/>
+        </w:rPr>
+        <w:t>saat</w:t>
+      </w:r>
+      <w:proofErr w:type="spellEnd"/>
+      <w:r>
+        <w:rPr>
+          <w:sz w:val="28"/>
+          <w:szCs w:val="28"/>
+        </w:rPr>
+        <w:t xml:space="preserve"> </w:t>
+      </w:r>
+      <w:proofErr w:type="spellStart"/>
+      <w:r>
+        <w:rPr>
+          <w:sz w:val="28"/>
+          <w:szCs w:val="28"/>
+        </w:rPr>
+        <w:t>ini</w:t>
+      </w:r>
+      <w:proofErr w:type="spellEnd"/>
+      <w:r>
+        <w:rPr>
+          <w:sz w:val="28"/>
+          <w:szCs w:val="28"/>
+        </w:rPr>
+        <w:t>.</w:t>
+      </w:r>
+      <w:r>
+        <w:rPr>
+          <w:sz w:val="28"/>
+          <w:szCs w:val="28"/>
+        </w:rPr>
+        <w:t xml:space="preserve"> </w:t>
+      </w:r>
+      <w:proofErr w:type="spellStart"/>
+      <w:r>
+        <w:rPr>
+          <w:sz w:val="28"/>
+          <w:szCs w:val="28"/>
+        </w:rPr>
+        <w:t>Kemudian</w:t>
+      </w:r>
+      <w:proofErr w:type="spellEnd"/>
+      <w:r>
+        <w:rPr>
+          <w:sz w:val="28"/>
+          <w:szCs w:val="28"/>
+        </w:rPr>
+        <w:t xml:space="preserve"> </w:t>
+      </w:r>
+      <w:proofErr w:type="spellStart"/>
+      <w:r>
+        <w:rPr>
+          <w:sz w:val="28"/>
+          <w:szCs w:val="28"/>
+        </w:rPr>
+        <w:t>akan</w:t>
+      </w:r>
+      <w:proofErr w:type="spellEnd"/>
+      <w:r>
+        <w:rPr>
+          <w:sz w:val="28"/>
+          <w:szCs w:val="28"/>
+        </w:rPr>
+        <w:t xml:space="preserve"> </w:t>
+      </w:r>
+      <w:proofErr w:type="spellStart"/>
+      <w:r>
+        <w:rPr>
+          <w:sz w:val="28"/>
+          <w:szCs w:val="28"/>
+        </w:rPr>
+        <w:t>menjalankan</w:t>
+      </w:r>
+      <w:proofErr w:type="spellEnd"/>
+      <w:r>
+        <w:rPr>
+          <w:sz w:val="28"/>
+          <w:szCs w:val="28"/>
+        </w:rPr>
+        <w:t xml:space="preserve"> Constructor yang </w:t>
+      </w:r>
+      <w:proofErr w:type="spellStart"/>
+      <w:r>
+        <w:rPr>
+          <w:sz w:val="28"/>
+          <w:szCs w:val="28"/>
+        </w:rPr>
+        <w:t>mengatur</w:t>
+      </w:r>
+      <w:proofErr w:type="spellEnd"/>
+      <w:r>
+        <w:rPr>
+          <w:sz w:val="28"/>
+          <w:szCs w:val="28"/>
+        </w:rPr>
+        <w:t xml:space="preserve"> s</w:t>
+      </w:r>
+      <w:r>
+        <w:rPr>
+          <w:sz w:val="28"/>
+          <w:szCs w:val="28"/>
+        </w:rPr>
+        <w:t xml:space="preserve">tate </w:t>
+      </w:r>
+      <w:proofErr w:type="spellStart"/>
+      <w:r>
+        <w:rPr>
+          <w:sz w:val="28"/>
+          <w:szCs w:val="28"/>
+        </w:rPr>
+        <w:t>awal</w:t>
+      </w:r>
+      <w:proofErr w:type="spellEnd"/>
+      <w:r>
+        <w:rPr>
+          <w:sz w:val="28"/>
+          <w:szCs w:val="28"/>
+        </w:rPr>
+        <w:t xml:space="preserve"> </w:t>
+      </w:r>
+      <w:proofErr w:type="spellStart"/>
+      <w:r>
+        <w:rPr>
+          <w:sz w:val="28"/>
+          <w:szCs w:val="28"/>
+        </w:rPr>
+        <w:t>pintu</w:t>
+      </w:r>
+      <w:proofErr w:type="spellEnd"/>
+      <w:r>
+        <w:rPr>
+          <w:sz w:val="28"/>
+          <w:szCs w:val="28"/>
+        </w:rPr>
+        <w:t xml:space="preserve"> </w:t>
+      </w:r>
+      <w:proofErr w:type="spellStart"/>
+      <w:r>
+        <w:rPr>
+          <w:sz w:val="28"/>
+          <w:szCs w:val="28"/>
+        </w:rPr>
+        <w:t>menjadi</w:t>
+      </w:r>
+      <w:proofErr w:type="spellEnd"/>
+      <w:r>
+        <w:rPr>
+          <w:sz w:val="28"/>
+          <w:szCs w:val="28"/>
+        </w:rPr>
+        <w:t xml:space="preserve"> "</w:t>
+      </w:r>
+      <w:proofErr w:type="spellStart"/>
+      <w:r>
+        <w:rPr>
+          <w:sz w:val="28"/>
+          <w:szCs w:val="28"/>
+        </w:rPr>
+        <w:t>Terkunci</w:t>
+      </w:r>
+      <w:proofErr w:type="spellEnd"/>
+      <w:r>
+        <w:rPr>
+          <w:sz w:val="28"/>
+          <w:szCs w:val="28"/>
+        </w:rPr>
+        <w:t>"</w:t>
+      </w:r>
+      <w:r>
+        <w:rPr>
+          <w:sz w:val="28"/>
+          <w:szCs w:val="28"/>
+        </w:rPr>
+        <w:t xml:space="preserve"> dan </w:t>
+      </w:r>
+      <w:proofErr w:type="spellStart"/>
+      <w:r>
+        <w:rPr>
+          <w:sz w:val="28"/>
+          <w:szCs w:val="28"/>
+        </w:rPr>
+        <w:t>menampilkan</w:t>
+      </w:r>
+      <w:proofErr w:type="spellEnd"/>
+      <w:r>
+        <w:rPr>
+          <w:sz w:val="28"/>
+          <w:szCs w:val="28"/>
+        </w:rPr>
+        <w:t xml:space="preserve"> </w:t>
+      </w:r>
+      <w:proofErr w:type="spellStart"/>
+      <w:r>
+        <w:rPr>
+          <w:sz w:val="28"/>
+          <w:szCs w:val="28"/>
+        </w:rPr>
+        <w:t>pesan</w:t>
+      </w:r>
+      <w:proofErr w:type="spellEnd"/>
+      <w:r>
+        <w:rPr>
+          <w:sz w:val="28"/>
+          <w:szCs w:val="28"/>
+        </w:rPr>
+        <w:t xml:space="preserve"> "Pintu </w:t>
+      </w:r>
+      <w:proofErr w:type="spellStart"/>
+      <w:r>
+        <w:rPr>
+          <w:sz w:val="28"/>
+          <w:szCs w:val="28"/>
+        </w:rPr>
+        <w:t>terkunci</w:t>
+      </w:r>
+      <w:proofErr w:type="spellEnd"/>
+      <w:r>
+        <w:rPr>
+          <w:sz w:val="28"/>
+          <w:szCs w:val="28"/>
+        </w:rPr>
+        <w:t>" di console.</w:t>
+      </w:r>
+    </w:p>
+    <w:p>
+      <w:pPr>
+        <w:pStyle w:val="ListParagraph"/>
+        <w:rPr>
+          <w:sz w:val="28"/>
+          <w:szCs w:val="28"/>
+        </w:rPr>
+      </w:pPr>
+      <w:r>
+        <w:rPr>
+          <w:sz w:val="28"/>
+          <w:szCs w:val="28"/>
+        </w:rPr>
+        <w:drawing>
+          <wp:inline distT="0" distB="0" distL="0" distR="0" wp14:anchorId="3BB8F4DC" wp14:editId="41966128">
+            <wp:extent cx="5563376" cy="2991267"/>
+            <wp:effectExtent l="0" t="0" r="0" b="0"/>
+            <wp:docPr id="674477774" name="Picture 1"/>
+            <wp:cNvGraphicFramePr>
+              <a:graphicFrameLocks xmlns:a="http://schemas.openxmlformats.org/drawingml/2006/main" noChangeAspect="1"/>
+            </wp:cNvGraphicFramePr>
+            <a:graphic xmlns:a="http://schemas.openxmlformats.org/drawingml/2006/main">
+              <a:graphicData uri="http://schemas.openxmlformats.org/drawingml/2006/picture">
+                <pic:pic xmlns:pic="http://schemas.openxmlformats.org/drawingml/2006/picture">
+                  <pic:nvPicPr>
+                    <pic:cNvPr id="674477774" name=""/>
+                    <pic:cNvPicPr/>
+                  </pic:nvPicPr>
+                  <pic:blipFill>
+                    <a:blip r:embed="rId11"/>
+                    <a:stretch>
+                      <a:fillRect/>
+                    </a:stretch>
+                  </pic:blipFill>
+                  <pic:spPr>
+                    <a:xfrm>
+                      <a:off x="0" y="0"/>
+                      <a:ext cx="5563376" cy="2991267"/>
+                    </a:xfrm>
+                    <a:prstGeom prst="rect">
+                      <a:avLst/>
+                    </a:prstGeom>
+                  </pic:spPr>
+                </pic:pic>
+              </a:graphicData>
+            </a:graphic>
+          </wp:inline>
+        </w:drawing>
+      </w:r>
+    </w:p>
+    <w:p>
+      <w:pPr>
+        <w:pStyle w:val="ListParagraph"/>
+        <w:rPr>
+          <w:sz w:val="28"/>
+          <w:szCs w:val="28"/>
+        </w:rPr>
+      </w:pPr>
+      <w:r>
+        <w:rPr>
+          <w:sz w:val="28"/>
+          <w:szCs w:val="28"/>
+        </w:rPr>
+        <w:t xml:space="preserve">Method </w:t>
+      </w:r>
+      <w:proofErr w:type="spellStart"/>
+      <w:r>
+        <w:rPr>
+          <w:sz w:val="28"/>
+          <w:szCs w:val="28"/>
+        </w:rPr>
+        <w:t>ini</w:t>
+      </w:r>
+      <w:proofErr w:type="spellEnd"/>
+      <w:r>
+        <w:rPr>
+          <w:sz w:val="28"/>
+          <w:szCs w:val="28"/>
+        </w:rPr>
+        <w:t xml:space="preserve"> </w:t>
+      </w:r>
+      <w:proofErr w:type="spellStart"/>
+      <w:r>
+        <w:rPr>
+          <w:sz w:val="28"/>
+          <w:szCs w:val="28"/>
+        </w:rPr>
+        <w:t>digunakan</w:t>
+      </w:r>
+      <w:proofErr w:type="spellEnd"/>
+      <w:r>
+        <w:rPr>
+          <w:sz w:val="28"/>
+          <w:szCs w:val="28"/>
+        </w:rPr>
+        <w:t xml:space="preserve"> </w:t>
+      </w:r>
+      <w:proofErr w:type="spellStart"/>
+      <w:r>
+        <w:rPr>
+          <w:sz w:val="28"/>
+          <w:szCs w:val="28"/>
+        </w:rPr>
+        <w:t>untuk</w:t>
+      </w:r>
+      <w:proofErr w:type="spellEnd"/>
+      <w:r>
+        <w:rPr>
+          <w:sz w:val="28"/>
+          <w:szCs w:val="28"/>
+        </w:rPr>
+        <w:t xml:space="preserve"> </w:t>
+      </w:r>
+      <w:proofErr w:type="spellStart"/>
+      <w:r>
+        <w:rPr>
+          <w:sz w:val="28"/>
+          <w:szCs w:val="28"/>
+        </w:rPr>
+        <w:t>mengubah</w:t>
+      </w:r>
+      <w:proofErr w:type="spellEnd"/>
+      <w:r>
+        <w:rPr>
+          <w:sz w:val="28"/>
+          <w:szCs w:val="28"/>
+        </w:rPr>
+        <w:t xml:space="preserve"> state </w:t>
+      </w:r>
+      <w:proofErr w:type="spellStart"/>
+      <w:r>
+        <w:rPr>
+          <w:sz w:val="28"/>
+          <w:szCs w:val="28"/>
+        </w:rPr>
+        <w:t>pintu</w:t>
+      </w:r>
+      <w:proofErr w:type="spellEnd"/>
+      <w:r>
+        <w:rPr>
+          <w:sz w:val="28"/>
+          <w:szCs w:val="28"/>
+        </w:rPr>
+        <w:t xml:space="preserve"> </w:t>
+      </w:r>
+      <w:proofErr w:type="spellStart"/>
+      <w:r>
+        <w:rPr>
+          <w:sz w:val="28"/>
+          <w:szCs w:val="28"/>
+        </w:rPr>
+        <w:t>menjadi</w:t>
+      </w:r>
+      <w:proofErr w:type="spellEnd"/>
+      <w:r>
+        <w:rPr>
+          <w:sz w:val="28"/>
+          <w:szCs w:val="28"/>
+        </w:rPr>
+        <w:t xml:space="preserve"> </w:t>
+      </w:r>
+      <w:proofErr w:type="spellStart"/>
+      <w:r>
+        <w:rPr>
+          <w:sz w:val="28"/>
+          <w:szCs w:val="28"/>
+        </w:rPr>
+        <w:t>terbuka</w:t>
+      </w:r>
+      <w:proofErr w:type="spellEnd"/>
+      <w:r>
+        <w:rPr>
+          <w:sz w:val="28"/>
+          <w:szCs w:val="28"/>
+        </w:rPr>
+        <w:t xml:space="preserve">. </w:t>
+      </w:r>
+      <w:r>
+        <w:rPr>
+          <w:sz w:val="28"/>
+          <w:szCs w:val="28"/>
+        </w:rPr>
+        <w:t xml:space="preserve">Jika </w:t>
+      </w:r>
+      <w:proofErr w:type="spellStart"/>
+      <w:r>
+        <w:rPr>
+          <w:sz w:val="28"/>
+          <w:szCs w:val="28"/>
+        </w:rPr>
+        <w:t>kondisi</w:t>
+      </w:r>
+      <w:proofErr w:type="spellEnd"/>
+      <w:r>
+        <w:rPr>
+          <w:sz w:val="28"/>
+          <w:szCs w:val="28"/>
+        </w:rPr>
+        <w:t xml:space="preserve"> </w:t>
+      </w:r>
+      <w:proofErr w:type="spellStart"/>
+      <w:r>
+        <w:rPr>
+          <w:sz w:val="28"/>
+          <w:szCs w:val="28"/>
+        </w:rPr>
+        <w:t>pintu</w:t>
+      </w:r>
+      <w:proofErr w:type="spellEnd"/>
+      <w:r>
+        <w:rPr>
+          <w:sz w:val="28"/>
+          <w:szCs w:val="28"/>
+        </w:rPr>
+        <w:t xml:space="preserve"> </w:t>
+      </w:r>
+      <w:proofErr w:type="spellStart"/>
+      <w:r>
+        <w:rPr>
+          <w:sz w:val="28"/>
+          <w:szCs w:val="28"/>
+        </w:rPr>
+        <w:t>t</w:t>
+      </w:r>
+      <w:r>
+        <w:rPr>
+          <w:sz w:val="28"/>
+          <w:szCs w:val="28"/>
+        </w:rPr>
+        <w:t>erkunci</w:t>
+      </w:r>
+      <w:proofErr w:type="spellEnd"/>
+      <w:r>
+        <w:rPr>
+          <w:sz w:val="28"/>
+          <w:szCs w:val="28"/>
+        </w:rPr>
+        <w:t xml:space="preserve"> </w:t>
+      </w:r>
+      <w:proofErr w:type="spellStart"/>
+      <w:r>
+        <w:rPr>
+          <w:sz w:val="28"/>
+          <w:szCs w:val="28"/>
+        </w:rPr>
+        <w:t>maka</w:t>
+      </w:r>
+      <w:proofErr w:type="spellEnd"/>
+      <w:r>
+        <w:rPr>
+          <w:sz w:val="28"/>
+          <w:szCs w:val="28"/>
+        </w:rPr>
+        <w:t xml:space="preserve"> </w:t>
+      </w:r>
+      <w:proofErr w:type="spellStart"/>
+      <w:r>
+        <w:rPr>
+          <w:sz w:val="28"/>
+          <w:szCs w:val="28"/>
+        </w:rPr>
+        <w:t>pintu</w:t>
+      </w:r>
+      <w:proofErr w:type="spellEnd"/>
+      <w:r>
+        <w:rPr>
+          <w:sz w:val="28"/>
+          <w:szCs w:val="28"/>
+        </w:rPr>
+        <w:t xml:space="preserve"> </w:t>
+      </w:r>
+      <w:proofErr w:type="spellStart"/>
+      <w:r>
+        <w:rPr>
+          <w:sz w:val="28"/>
+          <w:szCs w:val="28"/>
+        </w:rPr>
+        <w:t>akan</w:t>
+      </w:r>
+      <w:proofErr w:type="spellEnd"/>
+      <w:r>
+        <w:rPr>
+          <w:sz w:val="28"/>
+          <w:szCs w:val="28"/>
+        </w:rPr>
+        <w:t xml:space="preserve"> </w:t>
+      </w:r>
+      <w:proofErr w:type="spellStart"/>
+      <w:r>
+        <w:rPr>
+          <w:sz w:val="28"/>
+          <w:szCs w:val="28"/>
+        </w:rPr>
+        <w:t>berubah</w:t>
+      </w:r>
+      <w:proofErr w:type="spellEnd"/>
+      <w:r>
+        <w:rPr>
+          <w:sz w:val="28"/>
+          <w:szCs w:val="28"/>
+        </w:rPr>
+        <w:t xml:space="preserve"> </w:t>
+      </w:r>
+      <w:proofErr w:type="spellStart"/>
+      <w:r>
+        <w:rPr>
+          <w:sz w:val="28"/>
+          <w:szCs w:val="28"/>
+        </w:rPr>
+        <w:t>menjadi</w:t>
+      </w:r>
+      <w:proofErr w:type="spellEnd"/>
+      <w:r>
+        <w:rPr>
+          <w:sz w:val="28"/>
+          <w:szCs w:val="28"/>
+        </w:rPr>
+        <w:t xml:space="preserve"> </w:t>
+      </w:r>
+      <w:proofErr w:type="spellStart"/>
+      <w:r>
+        <w:rPr>
+          <w:sz w:val="28"/>
+          <w:szCs w:val="28"/>
+        </w:rPr>
+        <w:t>t</w:t>
+      </w:r>
+      <w:r>
+        <w:rPr>
+          <w:sz w:val="28"/>
+          <w:szCs w:val="28"/>
+        </w:rPr>
+        <w:t>erbuka</w:t>
+      </w:r>
+      <w:proofErr w:type="spellEnd"/>
+      <w:r>
+        <w:rPr>
+          <w:sz w:val="28"/>
+          <w:szCs w:val="28"/>
+        </w:rPr>
+        <w:t xml:space="preserve"> dan </w:t>
+      </w:r>
+      <w:proofErr w:type="spellStart"/>
+      <w:r>
+        <w:rPr>
+          <w:sz w:val="28"/>
+          <w:szCs w:val="28"/>
+        </w:rPr>
+        <w:t>jika</w:t>
+      </w:r>
+      <w:proofErr w:type="spellEnd"/>
+      <w:r>
+        <w:rPr>
+          <w:sz w:val="28"/>
+          <w:szCs w:val="28"/>
+        </w:rPr>
+        <w:t xml:space="preserve"> </w:t>
+      </w:r>
+      <w:proofErr w:type="spellStart"/>
+      <w:r>
+        <w:rPr>
+          <w:sz w:val="28"/>
+          <w:szCs w:val="28"/>
+        </w:rPr>
+        <w:t>kondisi</w:t>
+      </w:r>
+      <w:proofErr w:type="spellEnd"/>
+      <w:r>
+        <w:rPr>
+          <w:sz w:val="28"/>
+          <w:szCs w:val="28"/>
+        </w:rPr>
+        <w:t xml:space="preserve"> </w:t>
+      </w:r>
+      <w:proofErr w:type="spellStart"/>
+      <w:r>
+        <w:rPr>
+          <w:sz w:val="28"/>
+          <w:szCs w:val="28"/>
+        </w:rPr>
+        <w:t>pintu</w:t>
+      </w:r>
+      <w:proofErr w:type="spellEnd"/>
+      <w:r>
+        <w:rPr>
+          <w:sz w:val="28"/>
+          <w:szCs w:val="28"/>
+        </w:rPr>
+        <w:t xml:space="preserve"> </w:t>
+      </w:r>
+      <w:proofErr w:type="spellStart"/>
+      <w:r>
+        <w:rPr>
+          <w:sz w:val="28"/>
+          <w:szCs w:val="28"/>
+        </w:rPr>
+        <w:t>t</w:t>
+      </w:r>
+      <w:r>
+        <w:rPr>
+          <w:sz w:val="28"/>
+          <w:szCs w:val="28"/>
+        </w:rPr>
+        <w:t>erbuka</w:t>
+      </w:r>
+      <w:proofErr w:type="spellEnd"/>
+      <w:r>
+        <w:rPr>
+          <w:sz w:val="28"/>
+          <w:szCs w:val="28"/>
+        </w:rPr>
+        <w:t xml:space="preserve"> </w:t>
+      </w:r>
+      <w:proofErr w:type="spellStart"/>
+      <w:r>
+        <w:rPr>
+          <w:sz w:val="28"/>
+          <w:szCs w:val="28"/>
+        </w:rPr>
+        <w:t>maka</w:t>
+      </w:r>
+      <w:proofErr w:type="spellEnd"/>
+      <w:r>
+        <w:rPr>
+          <w:sz w:val="28"/>
+          <w:szCs w:val="28"/>
+        </w:rPr>
+        <w:t xml:space="preserve"> program me</w:t>
+      </w:r>
+      <w:proofErr w:type="spellStart"/>
+      <w:r>
+        <w:rPr>
+          <w:sz w:val="28"/>
+          <w:szCs w:val="28"/>
+        </w:rPr>
+        <w:t>nampilkan</w:t>
+      </w:r>
+      <w:proofErr w:type="spellEnd"/>
+      <w:r>
+        <w:rPr>
+          <w:sz w:val="28"/>
+          <w:szCs w:val="28"/>
+        </w:rPr>
+        <w:t xml:space="preserve"> </w:t>
+      </w:r>
+      <w:proofErr w:type="spellStart"/>
+      <w:r>
+        <w:rPr>
+          <w:sz w:val="28"/>
+          <w:szCs w:val="28"/>
+        </w:rPr>
+        <w:t>pesan</w:t>
+      </w:r>
+      <w:proofErr w:type="spellEnd"/>
+      <w:r>
+        <w:rPr>
+          <w:sz w:val="28"/>
+          <w:szCs w:val="28"/>
+        </w:rPr>
+        <w:t xml:space="preserve"> </w:t>
+      </w:r>
+      <w:proofErr w:type="spellStart"/>
+      <w:r>
+        <w:rPr>
+          <w:sz w:val="28"/>
+          <w:szCs w:val="28"/>
+        </w:rPr>
+        <w:t>bahwa</w:t>
+      </w:r>
+      <w:proofErr w:type="spellEnd"/>
+      <w:r>
+        <w:rPr>
+          <w:sz w:val="28"/>
+          <w:szCs w:val="28"/>
+        </w:rPr>
+        <w:t xml:space="preserve"> </w:t>
+      </w:r>
+      <w:proofErr w:type="spellStart"/>
+      <w:r>
+        <w:rPr>
+          <w:sz w:val="28"/>
+          <w:szCs w:val="28"/>
+        </w:rPr>
+        <w:t>pintu</w:t>
+      </w:r>
+      <w:proofErr w:type="spellEnd"/>
+      <w:r>
+        <w:rPr>
+          <w:sz w:val="28"/>
+          <w:szCs w:val="28"/>
+        </w:rPr>
+        <w:t xml:space="preserve"> </w:t>
+      </w:r>
+      <w:proofErr w:type="spellStart"/>
+      <w:r>
+        <w:rPr>
+          <w:sz w:val="28"/>
+          <w:szCs w:val="28"/>
+        </w:rPr>
+        <w:t>sudah</w:t>
+      </w:r>
+      <w:proofErr w:type="spellEnd"/>
+      <w:r>
+        <w:rPr>
+          <w:sz w:val="28"/>
+          <w:szCs w:val="28"/>
+        </w:rPr>
+        <w:t xml:space="preserve"> </w:t>
+      </w:r>
+      <w:proofErr w:type="spellStart"/>
+      <w:r>
+        <w:rPr>
+          <w:sz w:val="28"/>
+          <w:szCs w:val="28"/>
+        </w:rPr>
+        <w:t>terbuka</w:t>
+      </w:r>
+      <w:proofErr w:type="spellEnd"/>
+      <w:r>
+        <w:rPr>
+          <w:sz w:val="28"/>
+          <w:szCs w:val="28"/>
+        </w:rPr>
+        <w:t>.</w:t>
+      </w:r>
+    </w:p>
+    <w:p>
+      <w:pPr>
+        <w:pStyle w:val="ListParagraph"/>
+        <w:rPr>
+          <w:sz w:val="28"/>
+          <w:szCs w:val="28"/>
+        </w:rPr>
+      </w:pPr>
+      <w:r>
+        <w:rPr>
+          <w:sz w:val="28"/>
+          <w:szCs w:val="28"/>
+        </w:rPr>
+        <w:lastRenderedPageBreak/>
+        <w:drawing>
+          <wp:inline distT="0" distB="0" distL="0" distR="0" wp14:anchorId="463325B2" wp14:editId="3339F269">
+            <wp:extent cx="5630061" cy="3038899"/>
+            <wp:effectExtent l="0" t="0" r="8890" b="9525"/>
+            <wp:docPr id="1341700382" name="Picture 1"/>
+            <wp:cNvGraphicFramePr>
+              <a:graphicFrameLocks xmlns:a="http://schemas.openxmlformats.org/drawingml/2006/main" noChangeAspect="1"/>
+            </wp:cNvGraphicFramePr>
+            <a:graphic xmlns:a="http://schemas.openxmlformats.org/drawingml/2006/main">
+              <a:graphicData uri="http://schemas.openxmlformats.org/drawingml/2006/picture">
+                <pic:pic xmlns:pic="http://schemas.openxmlformats.org/drawingml/2006/picture">
+                  <pic:nvPicPr>
+                    <pic:cNvPr id="1341700382" name=""/>
+                    <pic:cNvPicPr/>
+                  </pic:nvPicPr>
+                  <pic:blipFill>
+                    <a:blip r:embed="rId12"/>
+                    <a:stretch>
+                      <a:fillRect/>
+                    </a:stretch>
+                  </pic:blipFill>
+                  <pic:spPr>
+                    <a:xfrm>
+                      <a:off x="0" y="0"/>
+                      <a:ext cx="5630061" cy="3038899"/>
+                    </a:xfrm>
+                    <a:prstGeom prst="rect">
+                      <a:avLst/>
+                    </a:prstGeom>
+                  </pic:spPr>
+                </pic:pic>
+              </a:graphicData>
+            </a:graphic>
+          </wp:inline>
+        </w:drawing>
+      </w:r>
+    </w:p>
+    <w:p>
+      <w:pPr>
+        <w:pStyle w:val="ListParagraph"/>
+        <w:rPr>
+          <w:sz w:val="28"/>
+          <w:szCs w:val="28"/>
+        </w:rPr>
+      </w:pPr>
+      <w:r>
+        <w:rPr>
+          <w:sz w:val="28"/>
+          <w:szCs w:val="28"/>
+        </w:rPr>
+        <w:t xml:space="preserve">Method </w:t>
+      </w:r>
+      <w:proofErr w:type="spellStart"/>
+      <w:r>
+        <w:rPr>
+          <w:sz w:val="28"/>
+          <w:szCs w:val="28"/>
+        </w:rPr>
+        <w:t>ini</w:t>
+      </w:r>
+      <w:proofErr w:type="spellEnd"/>
+      <w:r>
+        <w:rPr>
+          <w:sz w:val="28"/>
+          <w:szCs w:val="28"/>
+        </w:rPr>
+        <w:t xml:space="preserve"> </w:t>
+      </w:r>
+      <w:proofErr w:type="spellStart"/>
+      <w:r>
+        <w:rPr>
+          <w:sz w:val="28"/>
+          <w:szCs w:val="28"/>
+        </w:rPr>
+        <w:t>digunakan</w:t>
+      </w:r>
+      <w:proofErr w:type="spellEnd"/>
+      <w:r>
+        <w:rPr>
+          <w:sz w:val="28"/>
+          <w:szCs w:val="28"/>
+        </w:rPr>
+        <w:t xml:space="preserve"> </w:t>
+      </w:r>
+      <w:proofErr w:type="spellStart"/>
+      <w:r>
+        <w:rPr>
+          <w:sz w:val="28"/>
+          <w:szCs w:val="28"/>
+        </w:rPr>
+        <w:t>untuk</w:t>
+      </w:r>
+      <w:proofErr w:type="spellEnd"/>
+      <w:r>
+        <w:rPr>
+          <w:sz w:val="28"/>
+          <w:szCs w:val="28"/>
+        </w:rPr>
+        <w:t xml:space="preserve"> </w:t>
+      </w:r>
+      <w:proofErr w:type="spellStart"/>
+      <w:r>
+        <w:rPr>
+          <w:sz w:val="28"/>
+          <w:szCs w:val="28"/>
+        </w:rPr>
+        <w:t>mengubah</w:t>
+      </w:r>
+      <w:proofErr w:type="spellEnd"/>
+      <w:r>
+        <w:rPr>
+          <w:sz w:val="28"/>
+          <w:szCs w:val="28"/>
+        </w:rPr>
+        <w:t xml:space="preserve"> state </w:t>
+      </w:r>
+      <w:proofErr w:type="spellStart"/>
+      <w:r>
+        <w:rPr>
+          <w:sz w:val="28"/>
+          <w:szCs w:val="28"/>
+        </w:rPr>
+        <w:t>pintu</w:t>
+      </w:r>
+      <w:proofErr w:type="spellEnd"/>
+      <w:r>
+        <w:rPr>
+          <w:sz w:val="28"/>
+          <w:szCs w:val="28"/>
+        </w:rPr>
+        <w:t xml:space="preserve"> </w:t>
+      </w:r>
+      <w:proofErr w:type="spellStart"/>
+      <w:r>
+        <w:rPr>
+          <w:sz w:val="28"/>
+          <w:szCs w:val="28"/>
+        </w:rPr>
+        <w:t>menjadi</w:t>
+      </w:r>
+      <w:proofErr w:type="spellEnd"/>
+      <w:r>
+        <w:rPr>
+          <w:sz w:val="28"/>
+          <w:szCs w:val="28"/>
+        </w:rPr>
+        <w:t xml:space="preserve"> </w:t>
+      </w:r>
+      <w:proofErr w:type="spellStart"/>
+      <w:r>
+        <w:rPr>
+          <w:sz w:val="28"/>
+          <w:szCs w:val="28"/>
+        </w:rPr>
+        <w:t>ter</w:t>
+      </w:r>
+      <w:r>
+        <w:rPr>
+          <w:sz w:val="28"/>
+          <w:szCs w:val="28"/>
+        </w:rPr>
+        <w:t>kunci</w:t>
+      </w:r>
+      <w:proofErr w:type="spellEnd"/>
+      <w:r>
+        <w:rPr>
+          <w:sz w:val="28"/>
+          <w:szCs w:val="28"/>
+        </w:rPr>
+        <w:t xml:space="preserve">. </w:t>
+      </w:r>
+      <w:r>
+        <w:rPr>
+          <w:sz w:val="28"/>
+          <w:szCs w:val="28"/>
+        </w:rPr>
+        <w:t xml:space="preserve">Jika </w:t>
+      </w:r>
+      <w:proofErr w:type="spellStart"/>
+      <w:r>
+        <w:rPr>
+          <w:sz w:val="28"/>
+          <w:szCs w:val="28"/>
+        </w:rPr>
+        <w:t>kondisi</w:t>
+      </w:r>
+      <w:proofErr w:type="spellEnd"/>
+      <w:r>
+        <w:rPr>
+          <w:sz w:val="28"/>
+          <w:szCs w:val="28"/>
+        </w:rPr>
+        <w:t xml:space="preserve"> </w:t>
+      </w:r>
+      <w:proofErr w:type="spellStart"/>
+      <w:r>
+        <w:rPr>
+          <w:sz w:val="28"/>
+          <w:szCs w:val="28"/>
+        </w:rPr>
+        <w:t>pintu</w:t>
+      </w:r>
+      <w:proofErr w:type="spellEnd"/>
+      <w:r>
+        <w:rPr>
+          <w:sz w:val="28"/>
+          <w:szCs w:val="28"/>
+        </w:rPr>
+        <w:t xml:space="preserve"> </w:t>
+      </w:r>
+      <w:proofErr w:type="spellStart"/>
+      <w:r>
+        <w:rPr>
+          <w:sz w:val="28"/>
+          <w:szCs w:val="28"/>
+        </w:rPr>
+        <w:t>t</w:t>
+      </w:r>
+      <w:r>
+        <w:rPr>
+          <w:sz w:val="28"/>
+          <w:szCs w:val="28"/>
+        </w:rPr>
+        <w:t>er</w:t>
+      </w:r>
+      <w:r>
+        <w:rPr>
+          <w:sz w:val="28"/>
+          <w:szCs w:val="28"/>
+        </w:rPr>
+        <w:t>buka</w:t>
+      </w:r>
+      <w:proofErr w:type="spellEnd"/>
+      <w:r>
+        <w:rPr>
+          <w:sz w:val="28"/>
+          <w:szCs w:val="28"/>
+        </w:rPr>
+        <w:t xml:space="preserve"> </w:t>
+      </w:r>
+      <w:proofErr w:type="spellStart"/>
+      <w:r>
+        <w:rPr>
+          <w:sz w:val="28"/>
+          <w:szCs w:val="28"/>
+        </w:rPr>
+        <w:t>maka</w:t>
+      </w:r>
+      <w:proofErr w:type="spellEnd"/>
+      <w:r>
+        <w:rPr>
+          <w:sz w:val="28"/>
+          <w:szCs w:val="28"/>
+        </w:rPr>
+        <w:t xml:space="preserve"> </w:t>
+      </w:r>
+      <w:proofErr w:type="spellStart"/>
+      <w:r>
+        <w:rPr>
+          <w:sz w:val="28"/>
+          <w:szCs w:val="28"/>
+        </w:rPr>
+        <w:t>pintu</w:t>
+      </w:r>
+      <w:proofErr w:type="spellEnd"/>
+      <w:r>
+        <w:rPr>
+          <w:sz w:val="28"/>
+          <w:szCs w:val="28"/>
+        </w:rPr>
+        <w:t xml:space="preserve"> </w:t>
+      </w:r>
+      <w:proofErr w:type="spellStart"/>
+      <w:r>
+        <w:rPr>
+          <w:sz w:val="28"/>
+          <w:szCs w:val="28"/>
+        </w:rPr>
+        <w:t>akan</w:t>
+      </w:r>
+      <w:proofErr w:type="spellEnd"/>
+      <w:r>
+        <w:rPr>
+          <w:sz w:val="28"/>
+          <w:szCs w:val="28"/>
+        </w:rPr>
+        <w:t xml:space="preserve"> </w:t>
+      </w:r>
+      <w:proofErr w:type="spellStart"/>
+      <w:r>
+        <w:rPr>
+          <w:sz w:val="28"/>
+          <w:szCs w:val="28"/>
+        </w:rPr>
+        <w:t>berubah</w:t>
+      </w:r>
+      <w:proofErr w:type="spellEnd"/>
+      <w:r>
+        <w:rPr>
+          <w:sz w:val="28"/>
+          <w:szCs w:val="28"/>
+        </w:rPr>
+        <w:t xml:space="preserve"> </w:t>
+      </w:r>
+      <w:proofErr w:type="spellStart"/>
+      <w:r>
+        <w:rPr>
+          <w:sz w:val="28"/>
+          <w:szCs w:val="28"/>
+        </w:rPr>
+        <w:t>menjadi</w:t>
+      </w:r>
+      <w:proofErr w:type="spellEnd"/>
+      <w:r>
+        <w:rPr>
+          <w:sz w:val="28"/>
+          <w:szCs w:val="28"/>
+        </w:rPr>
+        <w:t xml:space="preserve"> </w:t>
+      </w:r>
+      <w:proofErr w:type="spellStart"/>
+      <w:r>
+        <w:rPr>
+          <w:sz w:val="28"/>
+          <w:szCs w:val="28"/>
+        </w:rPr>
+        <w:t>t</w:t>
+      </w:r>
+      <w:r>
+        <w:rPr>
+          <w:sz w:val="28"/>
+          <w:szCs w:val="28"/>
+        </w:rPr>
+        <w:t>er</w:t>
+      </w:r>
+      <w:r>
+        <w:rPr>
+          <w:sz w:val="28"/>
+          <w:szCs w:val="28"/>
+        </w:rPr>
+        <w:t>kunci</w:t>
+      </w:r>
+      <w:proofErr w:type="spellEnd"/>
+      <w:r>
+        <w:rPr>
+          <w:sz w:val="28"/>
+          <w:szCs w:val="28"/>
+        </w:rPr>
+        <w:t xml:space="preserve"> dan </w:t>
+      </w:r>
+      <w:proofErr w:type="spellStart"/>
+      <w:r>
+        <w:rPr>
+          <w:sz w:val="28"/>
+          <w:szCs w:val="28"/>
+        </w:rPr>
+        <w:t>jika</w:t>
+      </w:r>
+      <w:proofErr w:type="spellEnd"/>
+      <w:r>
+        <w:rPr>
+          <w:sz w:val="28"/>
+          <w:szCs w:val="28"/>
+        </w:rPr>
+        <w:t xml:space="preserve"> </w:t>
+      </w:r>
+      <w:proofErr w:type="spellStart"/>
+      <w:r>
+        <w:rPr>
+          <w:sz w:val="28"/>
+          <w:szCs w:val="28"/>
+        </w:rPr>
+        <w:t>kondisi</w:t>
+      </w:r>
+      <w:proofErr w:type="spellEnd"/>
+      <w:r>
+        <w:rPr>
+          <w:sz w:val="28"/>
+          <w:szCs w:val="28"/>
+        </w:rPr>
+        <w:t xml:space="preserve"> </w:t>
+      </w:r>
+      <w:proofErr w:type="spellStart"/>
+      <w:r>
+        <w:rPr>
+          <w:sz w:val="28"/>
+          <w:szCs w:val="28"/>
+        </w:rPr>
+        <w:t>pintu</w:t>
+      </w:r>
+      <w:proofErr w:type="spellEnd"/>
+      <w:r>
+        <w:rPr>
+          <w:sz w:val="28"/>
+          <w:szCs w:val="28"/>
+        </w:rPr>
+        <w:t xml:space="preserve"> </w:t>
+      </w:r>
+      <w:proofErr w:type="spellStart"/>
+      <w:r>
+        <w:rPr>
+          <w:sz w:val="28"/>
+          <w:szCs w:val="28"/>
+        </w:rPr>
+        <w:t>t</w:t>
+      </w:r>
+      <w:r>
+        <w:rPr>
+          <w:sz w:val="28"/>
+          <w:szCs w:val="28"/>
+        </w:rPr>
+        <w:t>er</w:t>
+      </w:r>
+      <w:r>
+        <w:rPr>
+          <w:sz w:val="28"/>
+          <w:szCs w:val="28"/>
+        </w:rPr>
+        <w:t>kunci</w:t>
+      </w:r>
+      <w:proofErr w:type="spellEnd"/>
+      <w:r>
+        <w:rPr>
+          <w:sz w:val="28"/>
+          <w:szCs w:val="28"/>
+        </w:rPr>
+        <w:t xml:space="preserve"> </w:t>
+      </w:r>
+      <w:proofErr w:type="spellStart"/>
+      <w:r>
+        <w:rPr>
+          <w:sz w:val="28"/>
+          <w:szCs w:val="28"/>
+        </w:rPr>
+        <w:t>maka</w:t>
+      </w:r>
+      <w:proofErr w:type="spellEnd"/>
+      <w:r>
+        <w:rPr>
+          <w:sz w:val="28"/>
+          <w:szCs w:val="28"/>
+        </w:rPr>
+        <w:t xml:space="preserve"> program </w:t>
+      </w:r>
+      <w:proofErr w:type="spellStart"/>
+      <w:r>
+        <w:rPr>
+          <w:sz w:val="28"/>
+          <w:szCs w:val="28"/>
+        </w:rPr>
+        <w:t>menampilkan</w:t>
+      </w:r>
+      <w:proofErr w:type="spellEnd"/>
+      <w:r>
+        <w:rPr>
+          <w:sz w:val="28"/>
+          <w:szCs w:val="28"/>
+        </w:rPr>
+        <w:t xml:space="preserve"> </w:t>
+      </w:r>
+      <w:proofErr w:type="spellStart"/>
+      <w:r>
+        <w:rPr>
+          <w:sz w:val="28"/>
+          <w:szCs w:val="28"/>
+        </w:rPr>
+        <w:t>pesan</w:t>
+      </w:r>
+      <w:proofErr w:type="spellEnd"/>
+      <w:r>
+        <w:rPr>
+          <w:sz w:val="28"/>
+          <w:szCs w:val="28"/>
+        </w:rPr>
+        <w:t xml:space="preserve"> </w:t>
+      </w:r>
+      <w:proofErr w:type="spellStart"/>
+      <w:r>
+        <w:rPr>
+          <w:sz w:val="28"/>
+          <w:szCs w:val="28"/>
+        </w:rPr>
+        <w:t>bahwa</w:t>
+      </w:r>
+      <w:proofErr w:type="spellEnd"/>
+      <w:r>
+        <w:rPr>
+          <w:sz w:val="28"/>
+          <w:szCs w:val="28"/>
+        </w:rPr>
+        <w:t xml:space="preserve"> </w:t>
+      </w:r>
+      <w:proofErr w:type="spellStart"/>
+      <w:r>
+        <w:rPr>
+          <w:sz w:val="28"/>
+          <w:szCs w:val="28"/>
+        </w:rPr>
+        <w:t>pintu</w:t>
+      </w:r>
+      <w:proofErr w:type="spellEnd"/>
+      <w:r>
+        <w:rPr>
+          <w:sz w:val="28"/>
+          <w:szCs w:val="28"/>
+        </w:rPr>
+        <w:t xml:space="preserve"> </w:t>
+      </w:r>
+      <w:proofErr w:type="spellStart"/>
+      <w:r>
+        <w:rPr>
+          <w:sz w:val="28"/>
+          <w:szCs w:val="28"/>
+        </w:rPr>
+        <w:t>sudah</w:t>
+      </w:r>
+      <w:proofErr w:type="spellEnd"/>
+      <w:r>
+        <w:rPr>
+          <w:sz w:val="28"/>
+          <w:szCs w:val="28"/>
+        </w:rPr>
+        <w:t xml:space="preserve"> </w:t>
+      </w:r>
+      <w:proofErr w:type="spellStart"/>
+      <w:r>
+        <w:rPr>
+          <w:sz w:val="28"/>
+          <w:szCs w:val="28"/>
+        </w:rPr>
+        <w:t>ter</w:t>
+      </w:r>
+      <w:r>
+        <w:rPr>
+          <w:sz w:val="28"/>
+          <w:szCs w:val="28"/>
+        </w:rPr>
+        <w:t>kunci</w:t>
+      </w:r>
+      <w:proofErr w:type="spellEnd"/>
+      <w:r>
+        <w:rPr>
+          <w:sz w:val="28"/>
+          <w:szCs w:val="28"/>
+        </w:rPr>
+        <w:t>.</w:t>
+      </w:r>
+    </w:p>
+    <w:p>
+      <w:pPr>
+        <w:pStyle w:val="ListParagraph"/>
+        <w:rPr>
+          <w:sz w:val="28"/>
+          <w:szCs w:val="28"/>
+        </w:rPr>
+      </w:pPr>
+    </w:p>
+    <w:p>
+      <w:pPr>
+        <w:pStyle w:val="ListParagraph"/>
+        <w:rPr>
+          <w:sz w:val="28"/>
+          <w:szCs w:val="28"/>
+        </w:rPr>
+      </w:pPr>
+    </w:p>
+    <w:p>
+      <w:pPr>
+        <w:pStyle w:val="ListParagraph"/>
+        <w:rPr>
+          <w:sz w:val="28"/>
+          <w:szCs w:val="28"/>
+        </w:rPr>
+      </w:pPr>
+    </w:p>
     <w:sectPr>
       <w:pgSz w:w="11906" w:h="16838"/>
       <w:pgMar w:top="1440" w:right="1440" w:bottom="1440" w:left="1440" w:header="708" w:footer="708" w:gutter="0"/>
@@ -11,6 +3521,675 @@
     </w:sectPr>
   </w:body>
 </w:document>
+</file>
+
+<file path=word/numbering.xml><?xml version="1.0" encoding="utf-8"?>
+<w:numbering xmlns:wpc="http://schemas.microsoft.com/office/word/2010/wordprocessingCanvas" xmlns:cx="http://schemas.microsoft.com/office/drawing/2014/chartex" xmlns:cx1="http://schemas.microsoft.com/office/drawing/2015/9/8/chartex" xmlns:cx2="http://schemas.microsoft.com/office/drawing/2015/10/21/chartex" xmlns:cx3="http://schemas.microsoft.com/office/drawing/2016/5/9/chartex" xmlns:cx4="http://schemas.microsoft.com/office/drawing/2016/5/10/chartex" xmlns:cx5="http://schemas.microsoft.com/office/drawing/2016/5/11/chartex" xmlns:cx6="http://schemas.microsoft.com/office/drawing/2016/5/12/chartex" xmlns:cx7="http://schemas.microsoft.com/office/drawing/2016/5/13/chartex" xmlns:cx8="http://schemas.microsoft.com/office/drawing/2016/5/14/chartex" xmlns:mc="http://schemas.openxmlformats.org/markup-compatibility/2006" xmlns:aink="http://schemas.microsoft.com/office/drawing/2016/ink" xmlns:am3d="http://schemas.microsoft.com/office/drawing/2017/model3d" xmlns:o="urn:schemas-microsoft-com:office:office" xmlns:oel="http://schemas.microsoft.com/office/2019/extlst" xmlns:r="http://schemas.openxmlformats.org/officeDocument/2006/relationships" xmlns:m="http://schemas.openxmlformats.org/officeDocument/2006/math" xmlns:v="urn:schemas-microsoft-com:vml" xmlns:wp14="http://schemas.microsoft.com/office/word/2010/wordprocessingDrawing" xmlns:wp="http://schemas.openxmlformats.org/drawingml/2006/wordprocessingDrawing" xmlns:w10="urn:schemas-microsoft-com:office:word" xmlns:w="http://schemas.openxmlformats.org/wordprocessingml/2006/main" xmlns:w14="http://schemas.microsoft.com/office/word/2010/wordml" xmlns:w15="http://schemas.microsoft.com/office/word/2012/wordml" xmlns:w16cex="http://schemas.microsoft.com/office/word/2018/wordml/cex" xmlns:w16cid="http://schemas.microsoft.com/office/word/2016/wordml/cid" xmlns:w16="http://schemas.microsoft.com/office/word/2018/wordml" xmlns:w16du="http://schemas.microsoft.com/office/word/2023/wordml/word16du" xmlns:w16sdtdh="http://schemas.microsoft.com/office/word/2020/wordml/sdtdatahash" xmlns:w16sdtfl="http://schemas.microsoft.com/office/word/2024/wordml/sdtformatlock" xmlns:w16se="http://schemas.microsoft.com/office/word/2015/wordml/symex" xmlns:wpg="http://schemas.microsoft.com/office/word/2010/wordprocessingGroup" xmlns:wpi="http://schemas.microsoft.com/office/word/2010/wordprocessingInk" xmlns:wne="http://schemas.microsoft.com/office/word/2006/wordml" xmlns:wps="http://schemas.microsoft.com/office/word/2010/wordprocessingShape" mc:Ignorable="w14 w15 w16se w16cid w16 w16cex w16sdtdh w16sdtfl w16du wp14">
+  <w:abstractNum w:abstractNumId="0" w15:restartNumberingAfterBreak="0">
+    <w:nsid w:val="1A927AD4"/>
+    <w:multiLevelType w:val="multilevel"/>
+    <w:tmpl w:val="D6B20F3C"/>
+    <w:lvl w:ilvl="0">
+      <w:start w:val="1"/>
+      <w:numFmt w:val="bullet"/>
+      <w:lvlText w:val=""/>
+      <w:lvlJc w:val="left"/>
+      <w:pPr>
+        <w:tabs>
+          <w:tab w:val="num" w:pos="720"/>
+        </w:tabs>
+        <w:ind w:left="720" w:hanging="360"/>
+      </w:pPr>
+      <w:rPr>
+        <w:rFonts w:ascii="Symbol" w:hAnsi="Symbol" w:hint="default"/>
+        <w:sz w:val="20"/>
+      </w:rPr>
+    </w:lvl>
+    <w:lvl w:ilvl="1" w:tentative="1">
+      <w:start w:val="1"/>
+      <w:numFmt w:val="bullet"/>
+      <w:lvlText w:val="o"/>
+      <w:lvlJc w:val="left"/>
+      <w:pPr>
+        <w:tabs>
+          <w:tab w:val="num" w:pos="1440"/>
+        </w:tabs>
+        <w:ind w:left="1440" w:hanging="360"/>
+      </w:pPr>
+      <w:rPr>
+        <w:rFonts w:ascii="Courier New" w:hAnsi="Courier New" w:hint="default"/>
+        <w:sz w:val="20"/>
+      </w:rPr>
+    </w:lvl>
+    <w:lvl w:ilvl="2" w:tentative="1">
+      <w:start w:val="1"/>
+      <w:numFmt w:val="bullet"/>
+      <w:lvlText w:val=""/>
+      <w:lvlJc w:val="left"/>
+      <w:pPr>
+        <w:tabs>
+          <w:tab w:val="num" w:pos="2160"/>
+        </w:tabs>
+        <w:ind w:left="2160" w:hanging="360"/>
+      </w:pPr>
+      <w:rPr>
+        <w:rFonts w:ascii="Wingdings" w:hAnsi="Wingdings" w:hint="default"/>
+        <w:sz w:val="20"/>
+      </w:rPr>
+    </w:lvl>
+    <w:lvl w:ilvl="3" w:tentative="1">
+      <w:start w:val="1"/>
+      <w:numFmt w:val="bullet"/>
+      <w:lvlText w:val=""/>
+      <w:lvlJc w:val="left"/>
+      <w:pPr>
+        <w:tabs>
+          <w:tab w:val="num" w:pos="2880"/>
+        </w:tabs>
+        <w:ind w:left="2880" w:hanging="360"/>
+      </w:pPr>
+      <w:rPr>
+        <w:rFonts w:ascii="Wingdings" w:hAnsi="Wingdings" w:hint="default"/>
+        <w:sz w:val="20"/>
+      </w:rPr>
+    </w:lvl>
+    <w:lvl w:ilvl="4" w:tentative="1">
+      <w:start w:val="1"/>
+      <w:numFmt w:val="bullet"/>
+      <w:lvlText w:val=""/>
+      <w:lvlJc w:val="left"/>
+      <w:pPr>
+        <w:tabs>
+          <w:tab w:val="num" w:pos="3600"/>
+        </w:tabs>
+        <w:ind w:left="3600" w:hanging="360"/>
+      </w:pPr>
+      <w:rPr>
+        <w:rFonts w:ascii="Wingdings" w:hAnsi="Wingdings" w:hint="default"/>
+        <w:sz w:val="20"/>
+      </w:rPr>
+    </w:lvl>
+    <w:lvl w:ilvl="5" w:tentative="1">
+      <w:start w:val="1"/>
+      <w:numFmt w:val="bullet"/>
+      <w:lvlText w:val=""/>
+      <w:lvlJc w:val="left"/>
+      <w:pPr>
+        <w:tabs>
+          <w:tab w:val="num" w:pos="4320"/>
+        </w:tabs>
+        <w:ind w:left="4320" w:hanging="360"/>
+      </w:pPr>
+      <w:rPr>
+        <w:rFonts w:ascii="Wingdings" w:hAnsi="Wingdings" w:hint="default"/>
+        <w:sz w:val="20"/>
+      </w:rPr>
+    </w:lvl>
+    <w:lvl w:ilvl="6" w:tentative="1">
+      <w:start w:val="1"/>
+      <w:numFmt w:val="bullet"/>
+      <w:lvlText w:val=""/>
+      <w:lvlJc w:val="left"/>
+      <w:pPr>
+        <w:tabs>
+          <w:tab w:val="num" w:pos="5040"/>
+        </w:tabs>
+        <w:ind w:left="5040" w:hanging="360"/>
+      </w:pPr>
+      <w:rPr>
+        <w:rFonts w:ascii="Wingdings" w:hAnsi="Wingdings" w:hint="default"/>
+        <w:sz w:val="20"/>
+      </w:rPr>
+    </w:lvl>
+    <w:lvl w:ilvl="7" w:tentative="1">
+      <w:start w:val="1"/>
+      <w:numFmt w:val="bullet"/>
+      <w:lvlText w:val=""/>
+      <w:lvlJc w:val="left"/>
+      <w:pPr>
+        <w:tabs>
+          <w:tab w:val="num" w:pos="5760"/>
+        </w:tabs>
+        <w:ind w:left="5760" w:hanging="360"/>
+      </w:pPr>
+      <w:rPr>
+        <w:rFonts w:ascii="Wingdings" w:hAnsi="Wingdings" w:hint="default"/>
+        <w:sz w:val="20"/>
+      </w:rPr>
+    </w:lvl>
+    <w:lvl w:ilvl="8" w:tentative="1">
+      <w:start w:val="1"/>
+      <w:numFmt w:val="bullet"/>
+      <w:lvlText w:val=""/>
+      <w:lvlJc w:val="left"/>
+      <w:pPr>
+        <w:tabs>
+          <w:tab w:val="num" w:pos="6480"/>
+        </w:tabs>
+        <w:ind w:left="6480" w:hanging="360"/>
+      </w:pPr>
+      <w:rPr>
+        <w:rFonts w:ascii="Wingdings" w:hAnsi="Wingdings" w:hint="default"/>
+        <w:sz w:val="20"/>
+      </w:rPr>
+    </w:lvl>
+  </w:abstractNum>
+  <w:abstractNum w:abstractNumId="1" w15:restartNumberingAfterBreak="0">
+    <w:nsid w:val="275F1CFE"/>
+    <w:multiLevelType w:val="multilevel"/>
+    <w:tmpl w:val="0262AAD0"/>
+    <w:lvl w:ilvl="0">
+      <w:start w:val="1"/>
+      <w:numFmt w:val="bullet"/>
+      <w:lvlText w:val=""/>
+      <w:lvlJc w:val="left"/>
+      <w:pPr>
+        <w:tabs>
+          <w:tab w:val="num" w:pos="720"/>
+        </w:tabs>
+        <w:ind w:left="720" w:hanging="360"/>
+      </w:pPr>
+      <w:rPr>
+        <w:rFonts w:ascii="Symbol" w:hAnsi="Symbol" w:hint="default"/>
+        <w:sz w:val="20"/>
+      </w:rPr>
+    </w:lvl>
+    <w:lvl w:ilvl="1" w:tentative="1">
+      <w:start w:val="1"/>
+      <w:numFmt w:val="bullet"/>
+      <w:lvlText w:val="o"/>
+      <w:lvlJc w:val="left"/>
+      <w:pPr>
+        <w:tabs>
+          <w:tab w:val="num" w:pos="1440"/>
+        </w:tabs>
+        <w:ind w:left="1440" w:hanging="360"/>
+      </w:pPr>
+      <w:rPr>
+        <w:rFonts w:ascii="Courier New" w:hAnsi="Courier New" w:hint="default"/>
+        <w:sz w:val="20"/>
+      </w:rPr>
+    </w:lvl>
+    <w:lvl w:ilvl="2" w:tentative="1">
+      <w:start w:val="1"/>
+      <w:numFmt w:val="bullet"/>
+      <w:lvlText w:val=""/>
+      <w:lvlJc w:val="left"/>
+      <w:pPr>
+        <w:tabs>
+          <w:tab w:val="num" w:pos="2160"/>
+        </w:tabs>
+        <w:ind w:left="2160" w:hanging="360"/>
+      </w:pPr>
+      <w:rPr>
+        <w:rFonts w:ascii="Wingdings" w:hAnsi="Wingdings" w:hint="default"/>
+        <w:sz w:val="20"/>
+      </w:rPr>
+    </w:lvl>
+    <w:lvl w:ilvl="3" w:tentative="1">
+      <w:start w:val="1"/>
+      <w:numFmt w:val="bullet"/>
+      <w:lvlText w:val=""/>
+      <w:lvlJc w:val="left"/>
+      <w:pPr>
+        <w:tabs>
+          <w:tab w:val="num" w:pos="2880"/>
+        </w:tabs>
+        <w:ind w:left="2880" w:hanging="360"/>
+      </w:pPr>
+      <w:rPr>
+        <w:rFonts w:ascii="Wingdings" w:hAnsi="Wingdings" w:hint="default"/>
+        <w:sz w:val="20"/>
+      </w:rPr>
+    </w:lvl>
+    <w:lvl w:ilvl="4" w:tentative="1">
+      <w:start w:val="1"/>
+      <w:numFmt w:val="bullet"/>
+      <w:lvlText w:val=""/>
+      <w:lvlJc w:val="left"/>
+      <w:pPr>
+        <w:tabs>
+          <w:tab w:val="num" w:pos="3600"/>
+        </w:tabs>
+        <w:ind w:left="3600" w:hanging="360"/>
+      </w:pPr>
+      <w:rPr>
+        <w:rFonts w:ascii="Wingdings" w:hAnsi="Wingdings" w:hint="default"/>
+        <w:sz w:val="20"/>
+      </w:rPr>
+    </w:lvl>
+    <w:lvl w:ilvl="5" w:tentative="1">
+      <w:start w:val="1"/>
+      <w:numFmt w:val="bullet"/>
+      <w:lvlText w:val=""/>
+      <w:lvlJc w:val="left"/>
+      <w:pPr>
+        <w:tabs>
+          <w:tab w:val="num" w:pos="4320"/>
+        </w:tabs>
+        <w:ind w:left="4320" w:hanging="360"/>
+      </w:pPr>
+      <w:rPr>
+        <w:rFonts w:ascii="Wingdings" w:hAnsi="Wingdings" w:hint="default"/>
+        <w:sz w:val="20"/>
+      </w:rPr>
+    </w:lvl>
+    <w:lvl w:ilvl="6" w:tentative="1">
+      <w:start w:val="1"/>
+      <w:numFmt w:val="bullet"/>
+      <w:lvlText w:val=""/>
+      <w:lvlJc w:val="left"/>
+      <w:pPr>
+        <w:tabs>
+          <w:tab w:val="num" w:pos="5040"/>
+        </w:tabs>
+        <w:ind w:left="5040" w:hanging="360"/>
+      </w:pPr>
+      <w:rPr>
+        <w:rFonts w:ascii="Wingdings" w:hAnsi="Wingdings" w:hint="default"/>
+        <w:sz w:val="20"/>
+      </w:rPr>
+    </w:lvl>
+    <w:lvl w:ilvl="7" w:tentative="1">
+      <w:start w:val="1"/>
+      <w:numFmt w:val="bullet"/>
+      <w:lvlText w:val=""/>
+      <w:lvlJc w:val="left"/>
+      <w:pPr>
+        <w:tabs>
+          <w:tab w:val="num" w:pos="5760"/>
+        </w:tabs>
+        <w:ind w:left="5760" w:hanging="360"/>
+      </w:pPr>
+      <w:rPr>
+        <w:rFonts w:ascii="Wingdings" w:hAnsi="Wingdings" w:hint="default"/>
+        <w:sz w:val="20"/>
+      </w:rPr>
+    </w:lvl>
+    <w:lvl w:ilvl="8" w:tentative="1">
+      <w:start w:val="1"/>
+      <w:numFmt w:val="bullet"/>
+      <w:lvlText w:val=""/>
+      <w:lvlJc w:val="left"/>
+      <w:pPr>
+        <w:tabs>
+          <w:tab w:val="num" w:pos="6480"/>
+        </w:tabs>
+        <w:ind w:left="6480" w:hanging="360"/>
+      </w:pPr>
+      <w:rPr>
+        <w:rFonts w:ascii="Wingdings" w:hAnsi="Wingdings" w:hint="default"/>
+        <w:sz w:val="20"/>
+      </w:rPr>
+    </w:lvl>
+  </w:abstractNum>
+  <w:abstractNum w:abstractNumId="2" w15:restartNumberingAfterBreak="0">
+    <w:nsid w:val="29113C00"/>
+    <w:multiLevelType w:val="multilevel"/>
+    <w:tmpl w:val="F9AAAEF0"/>
+    <w:lvl w:ilvl="0">
+      <w:start w:val="1"/>
+      <w:numFmt w:val="decimal"/>
+      <w:lvlText w:val="%1."/>
+      <w:lvlJc w:val="left"/>
+      <w:pPr>
+        <w:tabs>
+          <w:tab w:val="num" w:pos="720"/>
+        </w:tabs>
+        <w:ind w:left="720" w:hanging="360"/>
+      </w:pPr>
+    </w:lvl>
+    <w:lvl w:ilvl="1" w:tentative="1">
+      <w:start w:val="1"/>
+      <w:numFmt w:val="decimal"/>
+      <w:lvlText w:val="%2."/>
+      <w:lvlJc w:val="left"/>
+      <w:pPr>
+        <w:tabs>
+          <w:tab w:val="num" w:pos="1440"/>
+        </w:tabs>
+        <w:ind w:left="1440" w:hanging="360"/>
+      </w:pPr>
+    </w:lvl>
+    <w:lvl w:ilvl="2" w:tentative="1">
+      <w:start w:val="1"/>
+      <w:numFmt w:val="decimal"/>
+      <w:lvlText w:val="%3."/>
+      <w:lvlJc w:val="left"/>
+      <w:pPr>
+        <w:tabs>
+          <w:tab w:val="num" w:pos="2160"/>
+        </w:tabs>
+        <w:ind w:left="2160" w:hanging="360"/>
+      </w:pPr>
+    </w:lvl>
+    <w:lvl w:ilvl="3" w:tentative="1">
+      <w:start w:val="1"/>
+      <w:numFmt w:val="decimal"/>
+      <w:lvlText w:val="%4."/>
+      <w:lvlJc w:val="left"/>
+      <w:pPr>
+        <w:tabs>
+          <w:tab w:val="num" w:pos="2880"/>
+        </w:tabs>
+        <w:ind w:left="2880" w:hanging="360"/>
+      </w:pPr>
+    </w:lvl>
+    <w:lvl w:ilvl="4" w:tentative="1">
+      <w:start w:val="1"/>
+      <w:numFmt w:val="decimal"/>
+      <w:lvlText w:val="%5."/>
+      <w:lvlJc w:val="left"/>
+      <w:pPr>
+        <w:tabs>
+          <w:tab w:val="num" w:pos="3600"/>
+        </w:tabs>
+        <w:ind w:left="3600" w:hanging="360"/>
+      </w:pPr>
+    </w:lvl>
+    <w:lvl w:ilvl="5" w:tentative="1">
+      <w:start w:val="1"/>
+      <w:numFmt w:val="decimal"/>
+      <w:lvlText w:val="%6."/>
+      <w:lvlJc w:val="left"/>
+      <w:pPr>
+        <w:tabs>
+          <w:tab w:val="num" w:pos="4320"/>
+        </w:tabs>
+        <w:ind w:left="4320" w:hanging="360"/>
+      </w:pPr>
+    </w:lvl>
+    <w:lvl w:ilvl="6" w:tentative="1">
+      <w:start w:val="1"/>
+      <w:numFmt w:val="decimal"/>
+      <w:lvlText w:val="%7."/>
+      <w:lvlJc w:val="left"/>
+      <w:pPr>
+        <w:tabs>
+          <w:tab w:val="num" w:pos="5040"/>
+        </w:tabs>
+        <w:ind w:left="5040" w:hanging="360"/>
+      </w:pPr>
+    </w:lvl>
+    <w:lvl w:ilvl="7" w:tentative="1">
+      <w:start w:val="1"/>
+      <w:numFmt w:val="decimal"/>
+      <w:lvlText w:val="%8."/>
+      <w:lvlJc w:val="left"/>
+      <w:pPr>
+        <w:tabs>
+          <w:tab w:val="num" w:pos="5760"/>
+        </w:tabs>
+        <w:ind w:left="5760" w:hanging="360"/>
+      </w:pPr>
+    </w:lvl>
+    <w:lvl w:ilvl="8" w:tentative="1">
+      <w:start w:val="1"/>
+      <w:numFmt w:val="decimal"/>
+      <w:lvlText w:val="%9."/>
+      <w:lvlJc w:val="left"/>
+      <w:pPr>
+        <w:tabs>
+          <w:tab w:val="num" w:pos="6480"/>
+        </w:tabs>
+        <w:ind w:left="6480" w:hanging="360"/>
+      </w:pPr>
+    </w:lvl>
+  </w:abstractNum>
+  <w:abstractNum w:abstractNumId="3" w15:restartNumberingAfterBreak="0">
+    <w:nsid w:val="5B1F730D"/>
+    <w:multiLevelType w:val="hybridMultilevel"/>
+    <w:tmpl w:val="EE92DE28"/>
+    <w:lvl w:ilvl="0" w:tplc="3809000F">
+      <w:start w:val="1"/>
+      <w:numFmt w:val="decimal"/>
+      <w:lvlText w:val="%1."/>
+      <w:lvlJc w:val="left"/>
+      <w:pPr>
+        <w:ind w:left="720" w:hanging="360"/>
+      </w:pPr>
+      <w:rPr>
+        <w:rFonts w:hint="default"/>
+      </w:rPr>
+    </w:lvl>
+    <w:lvl w:ilvl="1" w:tplc="38090019" w:tentative="1">
+      <w:start w:val="1"/>
+      <w:numFmt w:val="lowerLetter"/>
+      <w:lvlText w:val="%2."/>
+      <w:lvlJc w:val="left"/>
+      <w:pPr>
+        <w:ind w:left="1440" w:hanging="360"/>
+      </w:pPr>
+    </w:lvl>
+    <w:lvl w:ilvl="2" w:tplc="3809001B" w:tentative="1">
+      <w:start w:val="1"/>
+      <w:numFmt w:val="lowerRoman"/>
+      <w:lvlText w:val="%3."/>
+      <w:lvlJc w:val="right"/>
+      <w:pPr>
+        <w:ind w:left="2160" w:hanging="180"/>
+      </w:pPr>
+    </w:lvl>
+    <w:lvl w:ilvl="3" w:tplc="3809000F" w:tentative="1">
+      <w:start w:val="1"/>
+      <w:numFmt w:val="decimal"/>
+      <w:lvlText w:val="%4."/>
+      <w:lvlJc w:val="left"/>
+      <w:pPr>
+        <w:ind w:left="2880" w:hanging="360"/>
+      </w:pPr>
+    </w:lvl>
+    <w:lvl w:ilvl="4" w:tplc="38090019" w:tentative="1">
+      <w:start w:val="1"/>
+      <w:numFmt w:val="lowerLetter"/>
+      <w:lvlText w:val="%5."/>
+      <w:lvlJc w:val="left"/>
+      <w:pPr>
+        <w:ind w:left="3600" w:hanging="360"/>
+      </w:pPr>
+    </w:lvl>
+    <w:lvl w:ilvl="5" w:tplc="3809001B" w:tentative="1">
+      <w:start w:val="1"/>
+      <w:numFmt w:val="lowerRoman"/>
+      <w:lvlText w:val="%6."/>
+      <w:lvlJc w:val="right"/>
+      <w:pPr>
+        <w:ind w:left="4320" w:hanging="180"/>
+      </w:pPr>
+    </w:lvl>
+    <w:lvl w:ilvl="6" w:tplc="3809000F" w:tentative="1">
+      <w:start w:val="1"/>
+      <w:numFmt w:val="decimal"/>
+      <w:lvlText w:val="%7."/>
+      <w:lvlJc w:val="left"/>
+      <w:pPr>
+        <w:ind w:left="5040" w:hanging="360"/>
+      </w:pPr>
+    </w:lvl>
+    <w:lvl w:ilvl="7" w:tplc="38090019" w:tentative="1">
+      <w:start w:val="1"/>
+      <w:numFmt w:val="lowerLetter"/>
+      <w:lvlText w:val="%8."/>
+      <w:lvlJc w:val="left"/>
+      <w:pPr>
+        <w:ind w:left="5760" w:hanging="360"/>
+      </w:pPr>
+    </w:lvl>
+    <w:lvl w:ilvl="8" w:tplc="3809001B" w:tentative="1">
+      <w:start w:val="1"/>
+      <w:numFmt w:val="lowerRoman"/>
+      <w:lvlText w:val="%9."/>
+      <w:lvlJc w:val="right"/>
+      <w:pPr>
+        <w:ind w:left="6480" w:hanging="180"/>
+      </w:pPr>
+    </w:lvl>
+  </w:abstractNum>
+  <w:abstractNum w:abstractNumId="4" w15:restartNumberingAfterBreak="0">
+    <w:nsid w:val="6C763A7E"/>
+    <w:multiLevelType w:val="multilevel"/>
+    <w:tmpl w:val="82823BB8"/>
+    <w:lvl w:ilvl="0">
+      <w:start w:val="1"/>
+      <w:numFmt w:val="bullet"/>
+      <w:lvlText w:val=""/>
+      <w:lvlJc w:val="left"/>
+      <w:pPr>
+        <w:tabs>
+          <w:tab w:val="num" w:pos="720"/>
+        </w:tabs>
+        <w:ind w:left="720" w:hanging="360"/>
+      </w:pPr>
+      <w:rPr>
+        <w:rFonts w:ascii="Symbol" w:hAnsi="Symbol" w:hint="default"/>
+        <w:sz w:val="20"/>
+      </w:rPr>
+    </w:lvl>
+    <w:lvl w:ilvl="1" w:tentative="1">
+      <w:start w:val="1"/>
+      <w:numFmt w:val="bullet"/>
+      <w:lvlText w:val="o"/>
+      <w:lvlJc w:val="left"/>
+      <w:pPr>
+        <w:tabs>
+          <w:tab w:val="num" w:pos="1440"/>
+        </w:tabs>
+        <w:ind w:left="1440" w:hanging="360"/>
+      </w:pPr>
+      <w:rPr>
+        <w:rFonts w:ascii="Courier New" w:hAnsi="Courier New" w:hint="default"/>
+        <w:sz w:val="20"/>
+      </w:rPr>
+    </w:lvl>
+    <w:lvl w:ilvl="2" w:tentative="1">
+      <w:start w:val="1"/>
+      <w:numFmt w:val="bullet"/>
+      <w:lvlText w:val=""/>
+      <w:lvlJc w:val="left"/>
+      <w:pPr>
+        <w:tabs>
+          <w:tab w:val="num" w:pos="2160"/>
+        </w:tabs>
+        <w:ind w:left="2160" w:hanging="360"/>
+      </w:pPr>
+      <w:rPr>
+        <w:rFonts w:ascii="Wingdings" w:hAnsi="Wingdings" w:hint="default"/>
+        <w:sz w:val="20"/>
+      </w:rPr>
+    </w:lvl>
+    <w:lvl w:ilvl="3" w:tentative="1">
+      <w:start w:val="1"/>
+      <w:numFmt w:val="bullet"/>
+      <w:lvlText w:val=""/>
+      <w:lvlJc w:val="left"/>
+      <w:pPr>
+        <w:tabs>
+          <w:tab w:val="num" w:pos="2880"/>
+        </w:tabs>
+        <w:ind w:left="2880" w:hanging="360"/>
+      </w:pPr>
+      <w:rPr>
+        <w:rFonts w:ascii="Wingdings" w:hAnsi="Wingdings" w:hint="default"/>
+        <w:sz w:val="20"/>
+      </w:rPr>
+    </w:lvl>
+    <w:lvl w:ilvl="4" w:tentative="1">
+      <w:start w:val="1"/>
+      <w:numFmt w:val="bullet"/>
+      <w:lvlText w:val=""/>
+      <w:lvlJc w:val="left"/>
+      <w:pPr>
+        <w:tabs>
+          <w:tab w:val="num" w:pos="3600"/>
+        </w:tabs>
+        <w:ind w:left="3600" w:hanging="360"/>
+      </w:pPr>
+      <w:rPr>
+        <w:rFonts w:ascii="Wingdings" w:hAnsi="Wingdings" w:hint="default"/>
+        <w:sz w:val="20"/>
+      </w:rPr>
+    </w:lvl>
+    <w:lvl w:ilvl="5" w:tentative="1">
+      <w:start w:val="1"/>
+      <w:numFmt w:val="bullet"/>
+      <w:lvlText w:val=""/>
+      <w:lvlJc w:val="left"/>
+      <w:pPr>
+        <w:tabs>
+          <w:tab w:val="num" w:pos="4320"/>
+        </w:tabs>
+        <w:ind w:left="4320" w:hanging="360"/>
+      </w:pPr>
+      <w:rPr>
+        <w:rFonts w:ascii="Wingdings" w:hAnsi="Wingdings" w:hint="default"/>
+        <w:sz w:val="20"/>
+      </w:rPr>
+    </w:lvl>
+    <w:lvl w:ilvl="6" w:tentative="1">
+      <w:start w:val="1"/>
+      <w:numFmt w:val="bullet"/>
+      <w:lvlText w:val=""/>
+      <w:lvlJc w:val="left"/>
+      <w:pPr>
+        <w:tabs>
+          <w:tab w:val="num" w:pos="5040"/>
+        </w:tabs>
+        <w:ind w:left="5040" w:hanging="360"/>
+      </w:pPr>
+      <w:rPr>
+        <w:rFonts w:ascii="Wingdings" w:hAnsi="Wingdings" w:hint="default"/>
+        <w:sz w:val="20"/>
+      </w:rPr>
+    </w:lvl>
+    <w:lvl w:ilvl="7" w:tentative="1">
+      <w:start w:val="1"/>
+      <w:numFmt w:val="bullet"/>
+      <w:lvlText w:val=""/>
+      <w:lvlJc w:val="left"/>
+      <w:pPr>
+        <w:tabs>
+          <w:tab w:val="num" w:pos="5760"/>
+        </w:tabs>
+        <w:ind w:left="5760" w:hanging="360"/>
+      </w:pPr>
+      <w:rPr>
+        <w:rFonts w:ascii="Wingdings" w:hAnsi="Wingdings" w:hint="default"/>
+        <w:sz w:val="20"/>
+      </w:rPr>
+    </w:lvl>
+    <w:lvl w:ilvl="8" w:tentative="1">
+      <w:start w:val="1"/>
+      <w:numFmt w:val="bullet"/>
+      <w:lvlText w:val=""/>
+      <w:lvlJc w:val="left"/>
+      <w:pPr>
+        <w:tabs>
+          <w:tab w:val="num" w:pos="6480"/>
+        </w:tabs>
+        <w:ind w:left="6480" w:hanging="360"/>
+      </w:pPr>
+      <w:rPr>
+        <w:rFonts w:ascii="Wingdings" w:hAnsi="Wingdings" w:hint="default"/>
+        <w:sz w:val="20"/>
+      </w:rPr>
+    </w:lvl>
+  </w:abstractNum>
+  <w:num w:numId="1" w16cid:durableId="119690358">
+    <w:abstractNumId w:val="3"/>
+  </w:num>
+  <w:num w:numId="2" w16cid:durableId="1244678160">
+    <w:abstractNumId w:val="4"/>
+  </w:num>
+  <w:num w:numId="3" w16cid:durableId="1485468529">
+    <w:abstractNumId w:val="0"/>
+  </w:num>
+  <w:num w:numId="4" w16cid:durableId="1866867715">
+    <w:abstractNumId w:val="2"/>
+  </w:num>
+  <w:num w:numId="5" w16cid:durableId="1116488190">
+    <w:abstractNumId w:val="1"/>
+  </w:num>
+</w:numbering>
 </file>
 
 <file path=word/styles.xml><?xml version="1.0" encoding="utf-8"?>
@@ -616,7 +4795,6 @@
   <w:style w:type="character" w:default="1" w:styleId="DefaultParagraphFont">
     <w:name w:val="Default Paragraph Font"/>
     <w:uiPriority w:val="1"/>
-    <w:semiHidden/>
     <w:unhideWhenUsed/>
   </w:style>
   <w:style w:type="table" w:default="1" w:styleId="TableNormal">
@@ -930,6 +5108,42 @@
       <w:spacing w:val="5"/>
     </w:rPr>
   </w:style>
+  <w:style w:type="character" w:styleId="Hyperlink">
+    <w:name w:val="Hyperlink"/>
+    <w:basedOn w:val="DefaultParagraphFont"/>
+    <w:uiPriority w:val="99"/>
+    <w:unhideWhenUsed/>
+    <w:rsid w:val="00BF4477"/>
+    <w:rPr>
+      <w:color w:val="467886" w:themeColor="hyperlink"/>
+      <w:u w:val="single"/>
+    </w:rPr>
+  </w:style>
+  <w:style w:type="character" w:styleId="UnresolvedMention">
+    <w:name w:val="Unresolved Mention"/>
+    <w:basedOn w:val="DefaultParagraphFont"/>
+    <w:uiPriority w:val="99"/>
+    <w:semiHidden/>
+    <w:unhideWhenUsed/>
+    <w:rsid w:val="00BF4477"/>
+    <w:rPr>
+      <w:color w:val="605E5C"/>
+      <w:shd w:val="clear" w:color="auto" w:fill="E1DFDD"/>
+    </w:rPr>
+  </w:style>
+  <w:style w:type="paragraph" w:styleId="NormalWeb">
+    <w:name w:val="Normal (Web)"/>
+    <w:basedOn w:val="Normal"/>
+    <w:uiPriority w:val="99"/>
+    <w:semiHidden/>
+    <w:unhideWhenUsed/>
+    <w:rsid w:val="00BF4477"/>
+    <w:rPr>
+      <w:rFonts w:ascii="Times New Roman" w:hAnsi="Times New Roman" w:cs="Times New Roman"/>
+      <w:sz w:val="24"/>
+      <w:szCs w:val="24"/>
+    </w:rPr>
+  </w:style>
 </w:styles>
 </file>
 

</xml_diff>